<commit_message>
Doc: log Phase 4.5 (autocorrect fix) and 4.6 (Picker tap conflict regression)
</commit_message>
<xml_diff>
--- a/PageKeep_Tester_Feedback_Gameplan.docx
+++ b/PageKeep_Tester_Feedback_Gameplan.docx
@@ -124,19 +124,19 @@
           <w:sz w:val="22"/>
           <w:szCs w:val="22"/>
         </w:rPr>
-        <w:t xml:space="preserve">1.1 Done-button-not-dismissing bug — DROP</w:t>
-      </w:r>
-    </w:p>
-    <w:p>
-      <w:pPr>
-        <w:spacing w:after="120" w:before="0"/>
-      </w:pPr>
-      <w:r>
-        <w:rPr>
-          <w:sz w:val="22"/>
-          <w:szCs w:val="22"/>
-        </w:rPr>
-        <w:t xml:space="preserve">Tester was unable to reproduce after retesting all four fields in the Add Annotation view. Removing from the work list. If it surfaces again in a future round, capture the field, the iOS version, and a short screen recording so we can locate the source.</w:t>
+        <w:t xml:space="preserve">1.1 Done-button-not-dismissing bug — REPRODUCED, FIX HANDLED IN PHASE 4.2</w:t>
+      </w:r>
+    </w:p>
+    <w:p>
+      <w:pPr>
+        <w:spacing w:after="120" w:before="0"/>
+      </w:pPr>
+      <w:r>
+        <w:rPr>
+          <w:sz w:val="22"/>
+          <w:szCs w:val="22"/>
+        </w:rPr>
+        <w:t xml:space="preserve">Reproduced on iOS 18.2 and iOS 26.1 in the simulator. Diagnostic data points to the system auto-injecting a Done button into the keyboard accessory bar (SystemInputAssistantView) when a .numberPad field is focused without an explicit ToolbarItemGroup(placement: .keyboard). The auto-injected button renders but its tap action is dropped during the layout's constraint recovery, so taps register without dismissing the keyboard. This is a long-standing SwiftUI/UIKit interop quirk, not iOS 26 specific. The fix is to add our own keyboard accessory toolbar — see Phase 4.2.</w:t>
       </w:r>
     </w:p>
     <w:p>
@@ -1087,7 +1087,28 @@
           <w:sz w:val="22"/>
           <w:szCs w:val="22"/>
         </w:rPr>
-        <w:t xml:space="preserve">. The checkmark replaces the (currently absent) Done text — glyph only, no label.</w:t>
+        <w:t xml:space="preserve">. The checkmark glyph button replaces the system-injected Done button entirely.</w:t>
+      </w:r>
+    </w:p>
+    <w:p>
+      <w:pPr>
+        <w:spacing w:after="120" w:before="0"/>
+      </w:pPr>
+      <w:r>
+        <w:rPr>
+          <w:b/>
+          <w:bCs/>
+          <w:sz w:val="22"/>
+          <w:szCs w:val="22"/>
+        </w:rPr>
+        <w:t xml:space="preserve">Note — also resolves item 1.1: </w:t>
+      </w:r>
+      <w:r>
+        <w:rPr>
+          <w:sz w:val="22"/>
+          <w:szCs w:val="22"/>
+        </w:rPr>
+        <w:t xml:space="preserve">this is the same change that fixes the unresponsive Done button reproduced on iOS 18.2 and iOS 26.1. Providing an explicit keyboard toolbar overrides the broken auto-injected one. After this lands, run the same reproduction steps from item 1.1 to confirm the Done-button-not-dismissing behavior is gone.</w:t>
       </w:r>
     </w:p>
     <w:p>
@@ -1111,7 +1132,7 @@
           <w:sz w:val="22"/>
           <w:szCs w:val="22"/>
         </w:rPr>
-        <w:t xml:space="preserve">Tapping anywhere outside a field now closes the keyboard. A blue checkmark in the keyboard bar dismisses it too.</w:t>
+        <w:t xml:space="preserve">Tapping anywhere outside a field now closes the keyboard. A blue checkmark in the keyboard bar dismisses it too. The unresponsive keyboard Done button from the previous build is fixed by the same change.</w:t>
       </w:r>
     </w:p>
     <w:p>
@@ -1326,6 +1347,473 @@
           <w:szCs w:val="22"/>
         </w:rPr>
         <w:t xml:space="preserve">The book description can now be expanded to read in full. There is also a primary Add to Bookshelf button at the bottom of the form so reaching the toolbar is no longer required.</w:t>
+      </w:r>
+    </w:p>
+    <w:p>
+      <w:pPr>
+        <w:pStyle w:val="Heading3"/>
+        <w:spacing w:after="100" w:before="200"/>
+      </w:pPr>
+      <w:r>
+        <w:rPr>
+          <w:b/>
+          <w:bCs/>
+          <w:sz w:val="22"/>
+          <w:szCs w:val="22"/>
+        </w:rPr>
+        <w:t xml:space="preserve">4.5 Fix autocorrect interfering with capitalization on Add Annotation fields</w:t>
+      </w:r>
+    </w:p>
+    <w:p>
+      <w:pPr>
+        <w:spacing w:after="120" w:before="0"/>
+      </w:pPr>
+      <w:r>
+        <w:rPr>
+          <w:sz w:val="22"/>
+          <w:szCs w:val="22"/>
+        </w:rPr>
+        <w:t xml:space="preserve">Bug discovered during Phase 4.1 testing: typing the first word of either the Quote or Personal Notes field and pressing space sometimes lower-cases the first letter even when the shift indicator was on. Root cause is iOS autocorrect replacing the perceived typo and changing case in the process. Neither field has explicit text-input behavior set, so they inherit aggressive UIKit defaults. Fix is to disable autocorrect on these specific fields while keeping sentence-capitalization on. Spell-check (red underlines) stays on — only the auto-replacement behavior is removed.</w:t>
+      </w:r>
+    </w:p>
+    <w:p>
+      <w:pPr>
+        <w:spacing w:after="120" w:before="0"/>
+      </w:pPr>
+      <w:r>
+        <w:rPr>
+          <w:sz w:val="22"/>
+          <w:szCs w:val="22"/>
+        </w:rPr>
+        <w:t xml:space="preserve">In </w:t>
+      </w:r>
+      <w:r>
+        <w:rPr>
+          <w:rFonts w:ascii="Courier New" w:cs="Courier New" w:eastAsia="Courier New" w:hAnsi="Courier New"/>
+          <w:sz w:val="22"/>
+          <w:szCs w:val="22"/>
+        </w:rPr>
+        <w:t xml:space="preserve">AddAnnotationView.swift</w:t>
+      </w:r>
+      <w:r>
+        <w:rPr>
+          <w:sz w:val="22"/>
+          <w:szCs w:val="22"/>
+        </w:rPr>
+        <w:t xml:space="preserve">, on the personal notes </w:t>
+      </w:r>
+      <w:r>
+        <w:rPr>
+          <w:rFonts w:ascii="Courier New" w:cs="Courier New" w:eastAsia="Courier New" w:hAnsi="Courier New"/>
+          <w:sz w:val="22"/>
+          <w:szCs w:val="22"/>
+        </w:rPr>
+        <w:t xml:space="preserve">TextField</w:t>
+      </w:r>
+      <w:r>
+        <w:rPr>
+          <w:sz w:val="22"/>
+          <w:szCs w:val="22"/>
+        </w:rPr>
+        <w:t xml:space="preserve"> (around line 209), add two modifiers after </w:t>
+      </w:r>
+      <w:r>
+        <w:rPr>
+          <w:rFonts w:ascii="Courier New" w:cs="Courier New" w:eastAsia="Courier New" w:hAnsi="Courier New"/>
+          <w:sz w:val="22"/>
+          <w:szCs w:val="22"/>
+        </w:rPr>
+        <w:t xml:space="preserve">.lineLimit(3...6)</w:t>
+      </w:r>
+      <w:r>
+        <w:rPr>
+          <w:sz w:val="22"/>
+          <w:szCs w:val="22"/>
+        </w:rPr>
+        <w:t xml:space="preserve">:</w:t>
+      </w:r>
+    </w:p>
+    <w:p>
+      <w:pPr>
+        <w:shd w:fill="F1EFE8" w:val="clear"/>
+        <w:spacing w:after="120" w:before="60"/>
+      </w:pPr>
+      <w:r>
+        <w:rPr>
+          <w:rFonts w:ascii="Courier New" w:cs="Courier New" w:eastAsia="Courier New" w:hAnsi="Courier New"/>
+          <w:sz w:val="20"/>
+          <w:szCs w:val="20"/>
+        </w:rPr>
+        <w:t xml:space="preserve">.textInputAutocapitalization(.sentences)
+.autocorrectionDisabled(true)</w:t>
+      </w:r>
+    </w:p>
+    <w:p>
+      <w:pPr>
+        <w:spacing w:after="120" w:before="0"/>
+      </w:pPr>
+      <w:r>
+        <w:rPr>
+          <w:sz w:val="22"/>
+          <w:szCs w:val="22"/>
+        </w:rPr>
+        <w:t xml:space="preserve">In </w:t>
+      </w:r>
+      <w:r>
+        <w:rPr>
+          <w:rFonts w:ascii="Courier New" w:cs="Courier New" w:eastAsia="Courier New" w:hAnsi="Courier New"/>
+          <w:sz w:val="22"/>
+          <w:szCs w:val="22"/>
+        </w:rPr>
+        <w:t xml:space="preserve">FormattedTextEditor.swift</w:t>
+      </w:r>
+      <w:r>
+        <w:rPr>
+          <w:sz w:val="22"/>
+          <w:szCs w:val="22"/>
+        </w:rPr>
+        <w:t xml:space="preserve">, inside </w:t>
+      </w:r>
+      <w:r>
+        <w:rPr>
+          <w:rFonts w:ascii="Courier New" w:cs="Courier New" w:eastAsia="Courier New" w:hAnsi="Courier New"/>
+          <w:sz w:val="22"/>
+          <w:szCs w:val="22"/>
+        </w:rPr>
+        <w:t xml:space="preserve">makeUIView</w:t>
+      </w:r>
+      <w:r>
+        <w:rPr>
+          <w:sz w:val="22"/>
+          <w:szCs w:val="22"/>
+        </w:rPr>
+        <w:t xml:space="preserve"> (around line 35, after </w:t>
+      </w:r>
+      <w:r>
+        <w:rPr>
+          <w:rFonts w:ascii="Courier New" w:cs="Courier New" w:eastAsia="Courier New" w:hAnsi="Courier New"/>
+          <w:sz w:val="22"/>
+          <w:szCs w:val="22"/>
+        </w:rPr>
+        <w:t xml:space="preserve">isScrollEnabled = true</w:t>
+      </w:r>
+      <w:r>
+        <w:rPr>
+          <w:sz w:val="22"/>
+          <w:szCs w:val="22"/>
+        </w:rPr>
+        <w:t xml:space="preserve">), add two lines:</w:t>
+      </w:r>
+    </w:p>
+    <w:p>
+      <w:pPr>
+        <w:shd w:fill="F1EFE8" w:val="clear"/>
+        <w:spacing w:after="120" w:before="60"/>
+      </w:pPr>
+      <w:r>
+        <w:rPr>
+          <w:rFonts w:ascii="Courier New" w:cs="Courier New" w:eastAsia="Courier New" w:hAnsi="Courier New"/>
+          <w:sz w:val="20"/>
+          <w:szCs w:val="20"/>
+        </w:rPr>
+        <w:t xml:space="preserve">textView.autocapitalizationType = .sentences
+textView.autocorrectionType = .no</w:t>
+      </w:r>
+    </w:p>
+    <w:p>
+      <w:pPr>
+        <w:spacing w:after="120" w:before="0"/>
+      </w:pPr>
+      <w:r>
+        <w:rPr>
+          <w:sz w:val="22"/>
+          <w:szCs w:val="22"/>
+        </w:rPr>
+        <w:t xml:space="preserve">Do not touch </w:t>
+      </w:r>
+      <w:r>
+        <w:rPr>
+          <w:rFonts w:ascii="Courier New" w:cs="Courier New" w:eastAsia="Courier New" w:hAnsi="Courier New"/>
+          <w:sz w:val="22"/>
+          <w:szCs w:val="22"/>
+        </w:rPr>
+        <w:t xml:space="preserve">spellCheckingType</w:t>
+      </w:r>
+      <w:r>
+        <w:rPr>
+          <w:sz w:val="22"/>
+          <w:szCs w:val="22"/>
+        </w:rPr>
+        <w:t xml:space="preserve"> — its default is correct, the red-underline spell check should stay on. Do not apply this to the page number field — </w:t>
+      </w:r>
+      <w:r>
+        <w:rPr>
+          <w:rFonts w:ascii="Courier New" w:cs="Courier New" w:eastAsia="Courier New" w:hAnsi="Courier New"/>
+          <w:sz w:val="22"/>
+          <w:szCs w:val="22"/>
+        </w:rPr>
+        <w:t xml:space="preserve">.numberPad</w:t>
+      </w:r>
+      <w:r>
+        <w:rPr>
+          <w:sz w:val="22"/>
+          <w:szCs w:val="22"/>
+        </w:rPr>
+        <w:t xml:space="preserve"> ignores these properties.</w:t>
+      </w:r>
+    </w:p>
+    <w:p>
+      <w:pPr>
+        <w:shd w:fill="E6F1FB" w:val="clear"/>
+        <w:spacing w:after="160" w:before="80"/>
+      </w:pPr>
+      <w:r>
+        <w:rPr>
+          <w:b/>
+          <w:bCs/>
+          <w:color w:val="0C447C"/>
+          <w:sz w:val="22"/>
+          <w:szCs w:val="22"/>
+        </w:rPr>
+        <w:t xml:space="preserve">Tester note: </w:t>
+      </w:r>
+      <w:r>
+        <w:rPr>
+          <w:color w:val="0C447C"/>
+          <w:sz w:val="22"/>
+          <w:szCs w:val="22"/>
+        </w:rPr>
+        <w:t xml:space="preserve">The keyboard's shift behavior on Add Annotation now respects what you actually typed. The first letter of a sentence still auto-capitalizes, but autocorrect no longer replaces words and inadvertently lowers the case. Misspelled words still get red underlines.</w:t>
+      </w:r>
+    </w:p>
+    <w:p>
+      <w:pPr>
+        <w:pStyle w:val="Heading3"/>
+        <w:spacing w:after="100" w:before="200"/>
+      </w:pPr>
+      <w:r>
+        <w:rPr>
+          <w:b/>
+          <w:bCs/>
+          <w:sz w:val="22"/>
+          <w:szCs w:val="22"/>
+        </w:rPr>
+        <w:t xml:space="preserve">4.6 Fix Phase 4.1 swallowing taps on the genre Picker</w:t>
+      </w:r>
+    </w:p>
+    <w:p>
+      <w:pPr>
+        <w:spacing w:after="120" w:before="0"/>
+      </w:pPr>
+      <w:r>
+        <w:rPr>
+          <w:sz w:val="22"/>
+          <w:szCs w:val="22"/>
+        </w:rPr>
+        <w:t xml:space="preserve">Regression discovered after Phase 4.1 landed. The three tap-to-dismiss modifiers added to the Form in AddAnnotationView.swift intercept taps on the genre Picker (Genre &amp; Color section), so the dropdown will not open and the user cannot switch which color palette is shown. The individual color circles inside AnnotationGenreColorPicker still work because they are explicit Button views with stronger gesture priority that override the parent tap. Anything that relies on default SwiftUI tap behavior — such as Picker opening its menu — is blocked by the parent .onTapGesture.</w:t>
+      </w:r>
+    </w:p>
+    <w:p>
+      <w:pPr>
+        <w:spacing w:after="120" w:before="0"/>
+      </w:pPr>
+      <w:r>
+        <w:rPr>
+          <w:sz w:val="22"/>
+          <w:szCs w:val="22"/>
+        </w:rPr>
+        <w:t xml:space="preserve">Fix: replace </w:t>
+      </w:r>
+      <w:r>
+        <w:rPr>
+          <w:rFonts w:ascii="Courier New" w:cs="Courier New" w:eastAsia="Courier New" w:hAnsi="Courier New"/>
+          <w:sz w:val="22"/>
+          <w:szCs w:val="22"/>
+        </w:rPr>
+        <w:t xml:space="preserve">.onTapGesture</w:t>
+      </w:r>
+      <w:r>
+        <w:rPr>
+          <w:sz w:val="22"/>
+          <w:szCs w:val="22"/>
+        </w:rPr>
+        <w:t xml:space="preserve"> with </w:t>
+      </w:r>
+      <w:r>
+        <w:rPr>
+          <w:rFonts w:ascii="Courier New" w:cs="Courier New" w:eastAsia="Courier New" w:hAnsi="Courier New"/>
+          <w:sz w:val="22"/>
+          <w:szCs w:val="22"/>
+        </w:rPr>
+        <w:t xml:space="preserve">.simultaneousGesture</w:t>
+      </w:r>
+      <w:r>
+        <w:rPr>
+          <w:sz w:val="22"/>
+          <w:szCs w:val="22"/>
+        </w:rPr>
+        <w:t xml:space="preserve"> so the parent gesture and the Picker's own tap can both fire. The other two modifiers (</w:t>
+      </w:r>
+      <w:r>
+        <w:rPr>
+          <w:rFonts w:ascii="Courier New" w:cs="Courier New" w:eastAsia="Courier New" w:hAnsi="Courier New"/>
+          <w:sz w:val="22"/>
+          <w:szCs w:val="22"/>
+        </w:rPr>
+        <w:t xml:space="preserve">.scrollDismissesKeyboard(.immediately)</w:t>
+      </w:r>
+      <w:r>
+        <w:rPr>
+          <w:sz w:val="22"/>
+          <w:szCs w:val="22"/>
+        </w:rPr>
+        <w:t xml:space="preserve"> and </w:t>
+      </w:r>
+      <w:r>
+        <w:rPr>
+          <w:rFonts w:ascii="Courier New" w:cs="Courier New" w:eastAsia="Courier New" w:hAnsi="Courier New"/>
+          <w:sz w:val="22"/>
+          <w:szCs w:val="22"/>
+        </w:rPr>
+        <w:t xml:space="preserve">.contentShape(Rectangle())</w:t>
+      </w:r>
+      <w:r>
+        <w:rPr>
+          <w:sz w:val="22"/>
+          <w:szCs w:val="22"/>
+        </w:rPr>
+        <w:t xml:space="preserve">) stay unchanged.</w:t>
+      </w:r>
+    </w:p>
+    <w:p>
+      <w:pPr>
+        <w:spacing w:after="120" w:before="0"/>
+      </w:pPr>
+      <w:r>
+        <w:rPr>
+          <w:sz w:val="22"/>
+          <w:szCs w:val="22"/>
+        </w:rPr>
+        <w:t xml:space="preserve">Currently:</w:t>
+      </w:r>
+    </w:p>
+    <w:p>
+      <w:pPr>
+        <w:shd w:fill="F1EFE8" w:val="clear"/>
+        <w:spacing w:after="120" w:before="60"/>
+      </w:pPr>
+      <w:r>
+        <w:rPr>
+          <w:rFonts w:ascii="Courier New" w:cs="Courier New" w:eastAsia="Courier New" w:hAnsi="Courier New"/>
+          <w:sz w:val="20"/>
+          <w:szCs w:val="20"/>
+        </w:rPr>
+        <w:t xml:space="preserve">.scrollDismissesKeyboard(.immediately)
+.contentShape(Rectangle())
+.onTapGesture { focusedField = nil }</w:t>
+      </w:r>
+    </w:p>
+    <w:p>
+      <w:pPr>
+        <w:spacing w:after="120" w:before="0"/>
+      </w:pPr>
+      <w:r>
+        <w:rPr>
+          <w:sz w:val="22"/>
+          <w:szCs w:val="22"/>
+        </w:rPr>
+        <w:t xml:space="preserve">Change to:</w:t>
+      </w:r>
+    </w:p>
+    <w:p>
+      <w:pPr>
+        <w:shd w:fill="F1EFE8" w:val="clear"/>
+        <w:spacing w:after="120" w:before="60"/>
+      </w:pPr>
+      <w:r>
+        <w:rPr>
+          <w:rFonts w:ascii="Courier New" w:cs="Courier New" w:eastAsia="Courier New" w:hAnsi="Courier New"/>
+          <w:sz w:val="20"/>
+          <w:szCs w:val="20"/>
+        </w:rPr>
+        <w:t xml:space="preserve">.scrollDismissesKeyboard(.immediately)
+.contentShape(Rectangle())
+.simultaneousGesture(TapGesture().onEnded { focusedField = nil })</w:t>
+      </w:r>
+    </w:p>
+    <w:p>
+      <w:pPr>
+        <w:spacing w:after="120" w:before="0"/>
+      </w:pPr>
+      <w:r>
+        <w:rPr>
+          <w:sz w:val="22"/>
+          <w:szCs w:val="22"/>
+        </w:rPr>
+        <w:t xml:space="preserve">Behavior after the fix: tapping empty form area dismisses the keyboard (unchanged), tapping a text field focuses it (unchanged), tapping the genre Picker now opens the menu AND dismisses any active keyboard, tapping a color circle selects the color AND dismisses any active keyboard. </w:t>
+      </w:r>
+      <w:r>
+        <w:rPr>
+          <w:b/>
+          <w:bCs/>
+          <w:sz w:val="22"/>
+          <w:szCs w:val="22"/>
+        </w:rPr>
+        <w:t xml:space="preserve">Do not apply this change to </w:t>
+      </w:r>
+      <w:r>
+        <w:rPr>
+          <w:rFonts w:ascii="Courier New" w:cs="Courier New" w:eastAsia="Courier New" w:hAnsi="Courier New"/>
+          <w:sz w:val="22"/>
+          <w:szCs w:val="22"/>
+        </w:rPr>
+        <w:t xml:space="preserve">AddBookview.swift</w:t>
+      </w:r>
+      <w:r>
+        <w:rPr>
+          <w:sz w:val="22"/>
+          <w:szCs w:val="22"/>
+        </w:rPr>
+        <w:t xml:space="preserve"> — that file has no Picker so there is no conflict. Leave its </w:t>
+      </w:r>
+      <w:r>
+        <w:rPr>
+          <w:rFonts w:ascii="Courier New" w:cs="Courier New" w:eastAsia="Courier New" w:hAnsi="Courier New"/>
+          <w:sz w:val="22"/>
+          <w:szCs w:val="22"/>
+        </w:rPr>
+        <w:t xml:space="preserve">.onTapGesture</w:t>
+      </w:r>
+      <w:r>
+        <w:rPr>
+          <w:sz w:val="22"/>
+          <w:szCs w:val="22"/>
+        </w:rPr>
+        <w:t xml:space="preserve"> alone.</w:t>
+      </w:r>
+    </w:p>
+    <w:p>
+      <w:pPr>
+        <w:shd w:fill="E6F1FB" w:val="clear"/>
+        <w:spacing w:after="160" w:before="80"/>
+      </w:pPr>
+      <w:r>
+        <w:rPr>
+          <w:b/>
+          <w:bCs/>
+          <w:color w:val="0C447C"/>
+          <w:sz w:val="22"/>
+          <w:szCs w:val="22"/>
+        </w:rPr>
+        <w:t xml:space="preserve">Tester note: </w:t>
+      </w:r>
+      <w:r>
+        <w:rPr>
+          <w:color w:val="0C447C"/>
+          <w:sz w:val="22"/>
+          <w:szCs w:val="22"/>
+        </w:rPr>
+        <w:t xml:space="preserve">The genre dropdown on the Add Annotation screen now opens when tapped. Switching genres changes which color palette is shown, as designed.</w:t>
       </w:r>
     </w:p>
     <w:p>
@@ -1399,33 +1887,34 @@
           <w:sz w:val="32"/>
           <w:szCs w:val="32"/>
         </w:rPr>
-        <w:t xml:space="preserve">Tester-facing build notes</w:t>
-      </w:r>
-    </w:p>
-    <w:p>
-      <w:pPr>
-        <w:spacing w:after="120" w:before="0"/>
-      </w:pPr>
-      <w:r>
-        <w:rPr>
-          <w:sz w:val="22"/>
-          <w:szCs w:val="22"/>
-        </w:rPr>
-        <w:t xml:space="preserve">Suggested copy for the next TestFlight release notes:</w:t>
-      </w:r>
-    </w:p>
-    <w:p>
-      <w:pPr>
-        <w:spacing w:after="120" w:before="0"/>
-      </w:pPr>
-      <w:r>
-        <w:rPr>
-          <w:b/>
-          <w:bCs/>
-          <w:sz w:val="22"/>
-          <w:szCs w:val="22"/>
-        </w:rPr>
-        <w:t xml:space="preserve">What's new in this build</w:t>
+        <w:t xml:space="preserve">Git workflow</w:t>
+      </w:r>
+    </w:p>
+    <w:p>
+      <w:pPr>
+        <w:spacing w:after="120" w:before="0"/>
+      </w:pPr>
+      <w:r>
+        <w:rPr>
+          <w:sz w:val="22"/>
+          <w:szCs w:val="22"/>
+        </w:rPr>
+        <w:t xml:space="preserve">All work for this round runs through a feature branch. Nothing lands on main until I have tested the resulting build on TestFlight and signed off.</w:t>
+      </w:r>
+    </w:p>
+    <w:p>
+      <w:pPr>
+        <w:pStyle w:val="Heading3"/>
+        <w:spacing w:after="100" w:before="200"/>
+      </w:pPr>
+      <w:r>
+        <w:rPr>
+          <w:b/>
+          <w:bCs/>
+          <w:sz w:val="22"/>
+          <w:szCs w:val="22"/>
+        </w:rPr>
+        <w:t xml:space="preserve">Repository</w:t>
       </w:r>
     </w:p>
     <w:p>
@@ -1442,7 +1931,7 @@
           <w:sz w:val="22"/>
           <w:szCs w:val="22"/>
         </w:rPr>
-        <w:t xml:space="preserve">Add Annotation: tap anywhere to dismiss the keyboard, plus a blue checkmark button in the keyboard bar</w:t>
+        <w:t xml:space="preserve">URL: https://github.com/Sumner-Digital/pageKeep.git</w:t>
       </w:r>
     </w:p>
     <w:p>
@@ -1459,7 +1948,7 @@
           <w:sz w:val="22"/>
           <w:szCs w:val="22"/>
         </w:rPr>
-        <w:t xml:space="preserve">Add Book: tap Show More to read the full book description; new Add to Bookshelf button at the bottom of the form</w:t>
+        <w:t xml:space="preserve">Default branch: main</w:t>
       </w:r>
     </w:p>
     <w:p>
@@ -1476,7 +1965,46 @@
           <w:sz w:val="22"/>
           <w:szCs w:val="22"/>
         </w:rPr>
-        <w:t xml:space="preserve">Book Detail: layout refresh — the Add Annotation button is now near the top, and reading progress sits below the status row</w:t>
+        <w:t xml:space="preserve">Authentication: HTTPS with your own GitHub PAT (classic, repo scope)</w:t>
+      </w:r>
+    </w:p>
+    <w:p>
+      <w:pPr>
+        <w:spacing w:after="120" w:before="0"/>
+      </w:pPr>
+      <w:r>
+        <w:rPr>
+          <w:sz w:val="22"/>
+          <w:szCs w:val="22"/>
+        </w:rPr>
+        <w:t xml:space="preserve">The current main is up to date as of the commit that includes this gameplan doc. Always pull main before branching.</w:t>
+      </w:r>
+    </w:p>
+    <w:p>
+      <w:pPr>
+        <w:pStyle w:val="Heading3"/>
+        <w:spacing w:after="100" w:before="200"/>
+      </w:pPr>
+      <w:r>
+        <w:rPr>
+          <w:b/>
+          <w:bCs/>
+          <w:sz w:val="22"/>
+          <w:szCs w:val="22"/>
+        </w:rPr>
+        <w:t xml:space="preserve">Branch strategy</w:t>
+      </w:r>
+    </w:p>
+    <w:p>
+      <w:pPr>
+        <w:spacing w:after="120" w:before="0"/>
+      </w:pPr>
+      <w:r>
+        <w:rPr>
+          <w:sz w:val="22"/>
+          <w:szCs w:val="22"/>
+        </w:rPr>
+        <w:t xml:space="preserve">Choose one of two approaches based on how you want to manage revisions.</w:t>
       </w:r>
     </w:p>
     <w:p>
@@ -1490,24 +2018,20 @@
       </w:pPr>
       <w:r>
         <w:rPr>
-          <w:sz w:val="22"/>
-          <w:szCs w:val="22"/>
-        </w:rPr>
-        <w:t xml:space="preserve">Update Progress and Edit Total Pages: clearer visual cue, the action button is now a blue Update directly above the number pad</w:t>
-      </w:r>
-    </w:p>
-    <w:p>
-      <w:pPr>
-        <w:spacing w:after="120" w:before="0"/>
-      </w:pPr>
-      <w:r>
-        <w:rPr>
-          <w:b/>
-          <w:bCs/>
-          <w:sz w:val="22"/>
-          <w:szCs w:val="22"/>
-        </w:rPr>
-        <w:t xml:space="preserve">Please verify</w:t>
+          <w:b/>
+          <w:bCs/>
+          <w:sz w:val="22"/>
+          <w:szCs w:val="22"/>
+        </w:rPr>
+        <w:t xml:space="preserve">Option A — single branch for the whole round: </w:t>
+      </w:r>
+      <w:r>
+        <w:rPr>
+          <w:rFonts w:ascii="Courier New" w:cs="Courier New" w:eastAsia="Courier New" w:hAnsi="Courier New"/>
+          <w:sz w:val="22"/>
+          <w:szCs w:val="22"/>
+        </w:rPr>
+        <w:t xml:space="preserve">feedback-round-1</w:t>
       </w:r>
     </w:p>
     <w:p>
@@ -1521,10 +2045,108 @@
       </w:pPr>
       <w:r>
         <w:rPr>
-          <w:sz w:val="22"/>
-          <w:szCs w:val="22"/>
-        </w:rPr>
-        <w:t xml:space="preserve">Saving an annotation with a page number higher than your current page does NOT change your current reading progress</w:t>
+          <w:b/>
+          <w:bCs/>
+          <w:sz w:val="22"/>
+          <w:szCs w:val="22"/>
+        </w:rPr>
+        <w:t xml:space="preserve">Option B — one branch per phase, one PR per phase (cleaner if any phase needs independent revisions): </w:t>
+      </w:r>
+      <w:r>
+        <w:rPr>
+          <w:rFonts w:ascii="Courier New" w:cs="Courier New" w:eastAsia="Courier New" w:hAnsi="Courier New"/>
+          <w:sz w:val="22"/>
+          <w:szCs w:val="22"/>
+        </w:rPr>
+        <w:t xml:space="preserve">feedback-p2-reorder</w:t>
+      </w:r>
+      <w:r>
+        <w:rPr>
+          <w:sz w:val="22"/>
+          <w:szCs w:val="22"/>
+        </w:rPr>
+        <w:t xml:space="preserve">, </w:t>
+      </w:r>
+      <w:r>
+        <w:rPr>
+          <w:rFonts w:ascii="Courier New" w:cs="Courier New" w:eastAsia="Courier New" w:hAnsi="Courier New"/>
+          <w:sz w:val="22"/>
+          <w:szCs w:val="22"/>
+        </w:rPr>
+        <w:t xml:space="preserve">feedback-p3-keyboard</w:t>
+      </w:r>
+      <w:r>
+        <w:rPr>
+          <w:sz w:val="22"/>
+          <w:szCs w:val="22"/>
+        </w:rPr>
+        <w:t xml:space="preserve">, </w:t>
+      </w:r>
+      <w:r>
+        <w:rPr>
+          <w:rFonts w:ascii="Courier New" w:cs="Courier New" w:eastAsia="Courier New" w:hAnsi="Courier New"/>
+          <w:sz w:val="22"/>
+          <w:szCs w:val="22"/>
+        </w:rPr>
+        <w:t xml:space="preserve">feedback-p4-add-book-add-annotation</w:t>
+      </w:r>
+    </w:p>
+    <w:p>
+      <w:pPr>
+        <w:spacing w:after="120" w:before="0"/>
+      </w:pPr>
+      <w:r>
+        <w:rPr>
+          <w:sz w:val="22"/>
+          <w:szCs w:val="22"/>
+        </w:rPr>
+        <w:t xml:space="preserve">In either case, branch off the latest main.</w:t>
+      </w:r>
+    </w:p>
+    <w:p>
+      <w:pPr>
+        <w:pStyle w:val="Heading3"/>
+        <w:spacing w:after="100" w:before="200"/>
+      </w:pPr>
+      <w:r>
+        <w:rPr>
+          <w:b/>
+          <w:bCs/>
+          <w:sz w:val="22"/>
+          <w:szCs w:val="22"/>
+        </w:rPr>
+        <w:t xml:space="preserve">Setup commands</w:t>
+      </w:r>
+    </w:p>
+    <w:p>
+      <w:pPr>
+        <w:shd w:fill="F1EFE8" w:val="clear"/>
+        <w:spacing w:after="120" w:before="60"/>
+      </w:pPr>
+      <w:r>
+        <w:rPr>
+          <w:rFonts w:ascii="Courier New" w:cs="Courier New" w:eastAsia="Courier New" w:hAnsi="Courier New"/>
+          <w:sz w:val="20"/>
+          <w:szCs w:val="20"/>
+        </w:rPr>
+        <w:t xml:space="preserve">git checkout main
+git pull origin main
+git checkout -b feedback-round-1</w:t>
+      </w:r>
+    </w:p>
+    <w:p>
+      <w:pPr>
+        <w:pStyle w:val="Heading3"/>
+        <w:spacing w:after="100" w:before="200"/>
+      </w:pPr>
+      <w:r>
+        <w:rPr>
+          <w:b/>
+          <w:bCs/>
+          <w:sz w:val="22"/>
+          <w:szCs w:val="22"/>
+        </w:rPr>
+        <w:t xml:space="preserve">Commit hygiene</w:t>
       </w:r>
     </w:p>
     <w:p>
@@ -1541,7 +2163,401 @@
           <w:sz w:val="22"/>
           <w:szCs w:val="22"/>
         </w:rPr>
-        <w:t xml:space="preserve">The Done-button-not-dismissing-keyboard issue from the last round can no longer be reproduced</w:t>
+        <w:t xml:space="preserve">One phase per commit minimum (Phase 2 in one commit, Phase 3 in one commit, etc.)</w:t>
+      </w:r>
+    </w:p>
+    <w:p>
+      <w:pPr>
+        <w:pStyle w:val="ListParagraph"/>
+        <w:numPr>
+          <w:ilvl w:val="0"/>
+          <w:numId w:val="2"/>
+        </w:numPr>
+        <w:spacing w:after="80" w:before="0"/>
+      </w:pPr>
+      <w:r>
+        <w:rPr>
+          <w:sz w:val="22"/>
+          <w:szCs w:val="22"/>
+        </w:rPr>
+        <w:t xml:space="preserve">Items 4.1, 4.2, 4.3, and 4.4 can each be their own commit since they are independent</w:t>
+      </w:r>
+    </w:p>
+    <w:p>
+      <w:pPr>
+        <w:pStyle w:val="ListParagraph"/>
+        <w:numPr>
+          <w:ilvl w:val="0"/>
+          <w:numId w:val="2"/>
+        </w:numPr>
+        <w:spacing w:after="80" w:before="0"/>
+      </w:pPr>
+      <w:r>
+        <w:rPr>
+          <w:sz w:val="22"/>
+          <w:szCs w:val="22"/>
+        </w:rPr>
+        <w:t xml:space="preserve">Avoid mixing concerns within a single commit — keeps the diff readable for review</w:t>
+      </w:r>
+    </w:p>
+    <w:p>
+      <w:pPr>
+        <w:pStyle w:val="ListParagraph"/>
+        <w:numPr>
+          <w:ilvl w:val="0"/>
+          <w:numId w:val="2"/>
+        </w:numPr>
+        <w:spacing w:after="80" w:before="0"/>
+      </w:pPr>
+      <w:r>
+        <w:rPr>
+          <w:sz w:val="22"/>
+          <w:szCs w:val="22"/>
+        </w:rPr>
+        <w:t xml:space="preserve">Use clear commit messages, e.g. "Phase 2: reorder Book Detail sections" or "Phase 4.3: add Read More toggle to book description in Add Book"</w:t>
+      </w:r>
+    </w:p>
+    <w:p>
+      <w:pPr>
+        <w:pStyle w:val="Heading3"/>
+        <w:spacing w:after="100" w:before="200"/>
+      </w:pPr>
+      <w:r>
+        <w:rPr>
+          <w:b/>
+          <w:bCs/>
+          <w:sz w:val="22"/>
+          <w:szCs w:val="22"/>
+        </w:rPr>
+        <w:t xml:space="preserve">Push and open a PR</w:t>
+      </w:r>
+    </w:p>
+    <w:p>
+      <w:pPr>
+        <w:shd w:fill="F1EFE8" w:val="clear"/>
+        <w:spacing w:after="120" w:before="60"/>
+      </w:pPr>
+      <w:r>
+        <w:rPr>
+          <w:rFonts w:ascii="Courier New" w:cs="Courier New" w:eastAsia="Courier New" w:hAnsi="Courier New"/>
+          <w:sz w:val="20"/>
+          <w:szCs w:val="20"/>
+        </w:rPr>
+        <w:t xml:space="preserve">git push -u origin feedback-round-1</w:t>
+      </w:r>
+    </w:p>
+    <w:p>
+      <w:pPr>
+        <w:spacing w:after="120" w:before="0"/>
+      </w:pPr>
+      <w:r>
+        <w:rPr>
+          <w:sz w:val="22"/>
+          <w:szCs w:val="22"/>
+        </w:rPr>
+        <w:t xml:space="preserve">Then open a pull request on github.com from your branch into main with a short description of what is included. I will review the diff there, build the branch in Xcode, and ship it to TestFlight for testing.</w:t>
+      </w:r>
+    </w:p>
+    <w:p>
+      <w:pPr>
+        <w:pStyle w:val="Heading3"/>
+        <w:spacing w:after="100" w:before="200"/>
+      </w:pPr>
+      <w:r>
+        <w:rPr>
+          <w:b/>
+          <w:bCs/>
+          <w:sz w:val="22"/>
+          <w:szCs w:val="22"/>
+        </w:rPr>
+        <w:t xml:space="preserve">Important — do not merge to main yourself</w:t>
+      </w:r>
+    </w:p>
+    <w:p>
+      <w:pPr>
+        <w:spacing w:after="120" w:before="0"/>
+      </w:pPr>
+      <w:r>
+        <w:rPr>
+          <w:sz w:val="22"/>
+          <w:szCs w:val="22"/>
+        </w:rPr>
+        <w:t xml:space="preserve">I will merge each PR only after I have tested the corresponding build. If anything needs revisions after I test, push fixup commits to the same branch and let me know — I will re-test before merging. This applies even if the changes look perfect to you. The merge button is mine for this round.</w:t>
+      </w:r>
+    </w:p>
+    <w:p>
+      <w:pPr>
+        <w:pStyle w:val="Heading3"/>
+        <w:spacing w:after="100" w:before="200"/>
+      </w:pPr>
+      <w:r>
+        <w:rPr>
+          <w:b/>
+          <w:bCs/>
+          <w:sz w:val="22"/>
+          <w:szCs w:val="22"/>
+        </w:rPr>
+        <w:t xml:space="preserve">Sanity check before any push</w:t>
+      </w:r>
+    </w:p>
+    <w:p>
+      <w:pPr>
+        <w:spacing w:after="120" w:before="0"/>
+      </w:pPr>
+      <w:r>
+        <w:rPr>
+          <w:sz w:val="22"/>
+          <w:szCs w:val="22"/>
+        </w:rPr>
+        <w:t xml:space="preserve">To avoid pushing into the wrong repo when working across multiple projects, run this from the repo folder before any push:</w:t>
+      </w:r>
+    </w:p>
+    <w:p>
+      <w:pPr>
+        <w:shd w:fill="F1EFE8" w:val="clear"/>
+        <w:spacing w:after="120" w:before="60"/>
+      </w:pPr>
+      <w:r>
+        <w:rPr>
+          <w:rFonts w:ascii="Courier New" w:cs="Courier New" w:eastAsia="Courier New" w:hAnsi="Courier New"/>
+          <w:sz w:val="20"/>
+          <w:szCs w:val="20"/>
+        </w:rPr>
+        <w:t xml:space="preserve">pwd &amp;&amp; git remote get-url origin &amp;&amp; git branch --show-current</w:t>
+      </w:r>
+    </w:p>
+    <w:p>
+      <w:pPr>
+        <w:spacing w:after="120" w:before="0"/>
+      </w:pPr>
+      <w:r>
+        <w:rPr>
+          <w:sz w:val="22"/>
+          <w:szCs w:val="22"/>
+        </w:rPr>
+        <w:t xml:space="preserve">Expect the path to end in </w:t>
+      </w:r>
+      <w:r>
+        <w:rPr>
+          <w:rFonts w:ascii="Courier New" w:cs="Courier New" w:eastAsia="Courier New" w:hAnsi="Courier New"/>
+          <w:sz w:val="22"/>
+          <w:szCs w:val="22"/>
+        </w:rPr>
+        <w:t xml:space="preserve">Bookshelf/Bookshelf</w:t>
+      </w:r>
+      <w:r>
+        <w:rPr>
+          <w:sz w:val="22"/>
+          <w:szCs w:val="22"/>
+        </w:rPr>
+        <w:t xml:space="preserve">, the remote URL to be </w:t>
+      </w:r>
+      <w:r>
+        <w:rPr>
+          <w:rFonts w:ascii="Courier New" w:cs="Courier New" w:eastAsia="Courier New" w:hAnsi="Courier New"/>
+          <w:sz w:val="22"/>
+          <w:szCs w:val="22"/>
+        </w:rPr>
+        <w:t xml:space="preserve">https://github.com/Sumner-Digital/pageKeep.git</w:t>
+      </w:r>
+      <w:r>
+        <w:rPr>
+          <w:sz w:val="22"/>
+          <w:szCs w:val="22"/>
+        </w:rPr>
+        <w:t xml:space="preserve">, and the branch to be your feature branch (not main).</w:t>
+      </w:r>
+    </w:p>
+    <w:p>
+      <w:pPr>
+        <w:pStyle w:val="Heading1"/>
+        <w:spacing w:after="180" w:before="360"/>
+      </w:pPr>
+      <w:r>
+        <w:rPr>
+          <w:b/>
+          <w:bCs/>
+          <w:color w:val="0C447C"/>
+          <w:sz w:val="32"/>
+          <w:szCs w:val="32"/>
+        </w:rPr>
+        <w:t xml:space="preserve">Tester-facing build notes</w:t>
+      </w:r>
+    </w:p>
+    <w:p>
+      <w:pPr>
+        <w:spacing w:after="120" w:before="0"/>
+      </w:pPr>
+      <w:r>
+        <w:rPr>
+          <w:sz w:val="22"/>
+          <w:szCs w:val="22"/>
+        </w:rPr>
+        <w:t xml:space="preserve">Suggested copy for the next TestFlight release notes:</w:t>
+      </w:r>
+    </w:p>
+    <w:p>
+      <w:pPr>
+        <w:spacing w:after="120" w:before="0"/>
+      </w:pPr>
+      <w:r>
+        <w:rPr>
+          <w:b/>
+          <w:bCs/>
+          <w:sz w:val="22"/>
+          <w:szCs w:val="22"/>
+        </w:rPr>
+        <w:t xml:space="preserve">What's new in this build</w:t>
+      </w:r>
+    </w:p>
+    <w:p>
+      <w:pPr>
+        <w:pStyle w:val="ListParagraph"/>
+        <w:numPr>
+          <w:ilvl w:val="0"/>
+          <w:numId w:val="2"/>
+        </w:numPr>
+        <w:spacing w:after="80" w:before="0"/>
+      </w:pPr>
+      <w:r>
+        <w:rPr>
+          <w:sz w:val="22"/>
+          <w:szCs w:val="22"/>
+        </w:rPr>
+        <w:t xml:space="preserve">Add Annotation: tap anywhere to dismiss the keyboard, plus a blue checkmark button in the keyboard bar</w:t>
+      </w:r>
+    </w:p>
+    <w:p>
+      <w:pPr>
+        <w:pStyle w:val="ListParagraph"/>
+        <w:numPr>
+          <w:ilvl w:val="0"/>
+          <w:numId w:val="2"/>
+        </w:numPr>
+        <w:spacing w:after="80" w:before="0"/>
+      </w:pPr>
+      <w:r>
+        <w:rPr>
+          <w:sz w:val="22"/>
+          <w:szCs w:val="22"/>
+        </w:rPr>
+        <w:t xml:space="preserve">Add Annotation: shift-key behavior now sticks — autocorrect no longer overrides your manual capitalization on the Quote or Personal Notes fields (red-underline spell check is still on)</w:t>
+      </w:r>
+    </w:p>
+    <w:p>
+      <w:pPr>
+        <w:pStyle w:val="ListParagraph"/>
+        <w:numPr>
+          <w:ilvl w:val="0"/>
+          <w:numId w:val="2"/>
+        </w:numPr>
+        <w:spacing w:after="80" w:before="0"/>
+      </w:pPr>
+      <w:r>
+        <w:rPr>
+          <w:sz w:val="22"/>
+          <w:szCs w:val="22"/>
+        </w:rPr>
+        <w:t xml:space="preserve">Add Annotation: the Genre dropdown now opens when tapped, so switching between color palettes works again (regression introduced when tap-to-dismiss was added, fixed in this build)</w:t>
+      </w:r>
+    </w:p>
+    <w:p>
+      <w:pPr>
+        <w:pStyle w:val="ListParagraph"/>
+        <w:numPr>
+          <w:ilvl w:val="0"/>
+          <w:numId w:val="2"/>
+        </w:numPr>
+        <w:spacing w:after="80" w:before="0"/>
+      </w:pPr>
+      <w:r>
+        <w:rPr>
+          <w:sz w:val="22"/>
+          <w:szCs w:val="22"/>
+        </w:rPr>
+        <w:t xml:space="preserve">Add Book: tap Show More to read the full book description; new Add to Bookshelf button at the bottom of the form</w:t>
+      </w:r>
+    </w:p>
+    <w:p>
+      <w:pPr>
+        <w:pStyle w:val="ListParagraph"/>
+        <w:numPr>
+          <w:ilvl w:val="0"/>
+          <w:numId w:val="2"/>
+        </w:numPr>
+        <w:spacing w:after="80" w:before="0"/>
+      </w:pPr>
+      <w:r>
+        <w:rPr>
+          <w:sz w:val="22"/>
+          <w:szCs w:val="22"/>
+        </w:rPr>
+        <w:t xml:space="preserve">Book Detail: layout refresh — the Add Annotation button is now near the top, and reading progress sits below the status row</w:t>
+      </w:r>
+    </w:p>
+    <w:p>
+      <w:pPr>
+        <w:pStyle w:val="ListParagraph"/>
+        <w:numPr>
+          <w:ilvl w:val="0"/>
+          <w:numId w:val="2"/>
+        </w:numPr>
+        <w:spacing w:after="80" w:before="0"/>
+      </w:pPr>
+      <w:r>
+        <w:rPr>
+          <w:sz w:val="22"/>
+          <w:szCs w:val="22"/>
+        </w:rPr>
+        <w:t xml:space="preserve">Update Progress and Edit Total Pages: clearer visual cue, the action button is now a blue Update directly above the number pad</w:t>
+      </w:r>
+    </w:p>
+    <w:p>
+      <w:pPr>
+        <w:spacing w:after="120" w:before="0"/>
+      </w:pPr>
+      <w:r>
+        <w:rPr>
+          <w:b/>
+          <w:bCs/>
+          <w:sz w:val="22"/>
+          <w:szCs w:val="22"/>
+        </w:rPr>
+        <w:t xml:space="preserve">Please verify</w:t>
+      </w:r>
+    </w:p>
+    <w:p>
+      <w:pPr>
+        <w:pStyle w:val="ListParagraph"/>
+        <w:numPr>
+          <w:ilvl w:val="0"/>
+          <w:numId w:val="2"/>
+        </w:numPr>
+        <w:spacing w:after="80" w:before="0"/>
+      </w:pPr>
+      <w:r>
+        <w:rPr>
+          <w:sz w:val="22"/>
+          <w:szCs w:val="22"/>
+        </w:rPr>
+        <w:t xml:space="preserve">Saving an annotation with a page number higher than your current page does NOT change your current reading progress</w:t>
+      </w:r>
+    </w:p>
+    <w:p>
+      <w:pPr>
+        <w:pStyle w:val="ListParagraph"/>
+        <w:numPr>
+          <w:ilvl w:val="0"/>
+          <w:numId w:val="2"/>
+        </w:numPr>
+        <w:spacing w:after="80" w:before="0"/>
+      </w:pPr>
+      <w:r>
+        <w:rPr>
+          <w:sz w:val="22"/>
+          <w:szCs w:val="22"/>
+        </w:rPr>
+        <w:t xml:space="preserve">The unresponsive Done button on the keyboard accessory bar (from the last round) is gone — replaced by a blue checkmark button that actually dismisses the keyboard</w:t>
       </w:r>
     </w:p>
     <w:sectPr>

</xml_diff>

<commit_message>
docs: round 1 implementation gameplan and round 2 tester notes
</commit_message>
<xml_diff>
--- a/PageKeep_Tester_Feedback_Gameplan.docx
+++ b/PageKeep_Tester_Feedback_Gameplan.docx
@@ -42,7 +42,7 @@
           <w:sz w:val="20"/>
           <w:szCs w:val="20"/>
         </w:rPr>
-        <w:t xml:space="preserve">Prepared May 3, 2026</w:t>
+        <w:t xml:space="preserve">Prepared May 3, 2026 — last updated May 7, 2026</w:t>
       </w:r>
     </w:p>
     <w:p>
@@ -86,6 +86,226 @@
     </w:p>
     <w:p>
       <w:pPr>
+        <w:pStyle w:val="Heading2"/>
+        <w:spacing w:after="140" w:before="280"/>
+      </w:pPr>
+      <w:r>
+        <w:rPr>
+          <w:b/>
+          <w:bCs/>
+          <w:color w:val="0C447C"/>
+          <w:sz w:val="26"/>
+          <w:szCs w:val="26"/>
+        </w:rPr>
+        <w:t xml:space="preserve">Implementation status</w:t>
+      </w:r>
+    </w:p>
+    <w:p>
+      <w:pPr>
+        <w:spacing w:after="120" w:before="0"/>
+      </w:pPr>
+      <w:r>
+        <w:rPr>
+          <w:sz w:val="22"/>
+          <w:szCs w:val="22"/>
+        </w:rPr>
+        <w:t xml:space="preserve">All Phase 1–4 items are implemented and verified on device. The feedback-round-1 branch is ready to merge to main once final review is complete. Phase 5 items remain in the backlog for a future round.</w:t>
+      </w:r>
+    </w:p>
+    <w:p>
+      <w:pPr>
+        <w:pStyle w:val="ListParagraph"/>
+        <w:numPr>
+          <w:ilvl w:val="0"/>
+          <w:numId w:val="2"/>
+        </w:numPr>
+        <w:spacing w:after="80" w:before="0"/>
+      </w:pPr>
+      <w:r>
+        <w:rPr>
+          <w:b/>
+          <w:bCs/>
+          <w:sz w:val="22"/>
+          <w:szCs w:val="22"/>
+        </w:rPr>
+        <w:t xml:space="preserve">Phase 1 — verification: </w:t>
+      </w:r>
+      <w:r>
+        <w:rPr>
+          <w:sz w:val="22"/>
+          <w:szCs w:val="22"/>
+        </w:rPr>
+        <w:t xml:space="preserve">complete (1.1 reproduced and resolved by 4.2 → 4.8; 1.2 and 1.3 confirmed clean)</w:t>
+      </w:r>
+    </w:p>
+    <w:p>
+      <w:pPr>
+        <w:pStyle w:val="ListParagraph"/>
+        <w:numPr>
+          <w:ilvl w:val="0"/>
+          <w:numId w:val="2"/>
+        </w:numPr>
+        <w:spacing w:after="80" w:before="0"/>
+      </w:pPr>
+      <w:r>
+        <w:rPr>
+          <w:b/>
+          <w:bCs/>
+          <w:sz w:val="22"/>
+          <w:szCs w:val="22"/>
+        </w:rPr>
+        <w:t xml:space="preserve">Phase 2 — Book Detail reorder: </w:t>
+      </w:r>
+      <w:r>
+        <w:rPr>
+          <w:sz w:val="22"/>
+          <w:szCs w:val="22"/>
+        </w:rPr>
+        <w:t xml:space="preserve">complete</w:t>
+      </w:r>
+    </w:p>
+    <w:p>
+      <w:pPr>
+        <w:pStyle w:val="ListParagraph"/>
+        <w:numPr>
+          <w:ilvl w:val="0"/>
+          <w:numId w:val="2"/>
+        </w:numPr>
+        <w:spacing w:after="80" w:before="0"/>
+      </w:pPr>
+      <w:r>
+        <w:rPr>
+          <w:b/>
+          <w:bCs/>
+          <w:sz w:val="22"/>
+          <w:szCs w:val="22"/>
+        </w:rPr>
+        <w:t xml:space="preserve">Phase 3 — keyboard accessory redesign on Update Progress / Edit Total Pages: </w:t>
+      </w:r>
+      <w:r>
+        <w:rPr>
+          <w:sz w:val="22"/>
+          <w:szCs w:val="22"/>
+        </w:rPr>
+        <w:t xml:space="preserve">complete</w:t>
+      </w:r>
+    </w:p>
+    <w:p>
+      <w:pPr>
+        <w:pStyle w:val="ListParagraph"/>
+        <w:numPr>
+          <w:ilvl w:val="0"/>
+          <w:numId w:val="2"/>
+        </w:numPr>
+        <w:spacing w:after="80" w:before="0"/>
+      </w:pPr>
+      <w:r>
+        <w:rPr>
+          <w:b/>
+          <w:bCs/>
+          <w:sz w:val="22"/>
+          <w:szCs w:val="22"/>
+        </w:rPr>
+        <w:t xml:space="preserve">Phase 4 — Add Book and Add Annotation polish: </w:t>
+      </w:r>
+      <w:r>
+        <w:rPr>
+          <w:sz w:val="22"/>
+          <w:szCs w:val="22"/>
+        </w:rPr>
+        <w:t xml:space="preserve">complete (4.1 through 4.8, including the iterative sub-fixes that emerged during testing — see individual phase entries below)</w:t>
+      </w:r>
+    </w:p>
+    <w:p>
+      <w:pPr>
+        <w:pStyle w:val="ListParagraph"/>
+        <w:numPr>
+          <w:ilvl w:val="0"/>
+          <w:numId w:val="2"/>
+        </w:numPr>
+        <w:spacing w:after="80" w:before="0"/>
+      </w:pPr>
+      <w:r>
+        <w:rPr>
+          <w:b/>
+          <w:bCs/>
+          <w:sz w:val="22"/>
+          <w:szCs w:val="22"/>
+        </w:rPr>
+        <w:t xml:space="preserve">Phase 5 — backlog: </w:t>
+      </w:r>
+      <w:r>
+        <w:rPr>
+          <w:sz w:val="22"/>
+          <w:szCs w:val="22"/>
+        </w:rPr>
+        <w:t xml:space="preserve">deferred to next round (5.1 cover scan, 5.2 stats scroll state, 5.3 bold/italic in Quote toolbar)</w:t>
+      </w:r>
+    </w:p>
+    <w:p>
+      <w:pPr>
+        <w:spacing w:after="120" w:before="0"/>
+      </w:pPr>
+      <w:r>
+        <w:rPr>
+          <w:sz w:val="22"/>
+          <w:szCs w:val="22"/>
+        </w:rPr>
+        <w:t xml:space="preserve">New files created during this round:</w:t>
+      </w:r>
+    </w:p>
+    <w:p>
+      <w:pPr>
+        <w:pStyle w:val="ListParagraph"/>
+        <w:numPr>
+          <w:ilvl w:val="0"/>
+          <w:numId w:val="2"/>
+        </w:numPr>
+        <w:spacing w:after="80" w:before="0"/>
+      </w:pPr>
+      <w:r>
+        <w:rPr>
+          <w:rFonts w:ascii="Courier New" w:cs="Courier New" w:eastAsia="Courier New" w:hAnsi="Courier New"/>
+          <w:sz w:val="22"/>
+          <w:szCs w:val="22"/>
+        </w:rPr>
+        <w:t xml:space="preserve">PageKeep/Components/PersonalNotesEditor.swift</w:t>
+      </w:r>
+      <w:r>
+        <w:rPr>
+          <w:sz w:val="22"/>
+          <w:szCs w:val="22"/>
+        </w:rPr>
+        <w:t xml:space="preserve"> — UIViewRepresentable wrapper for the Personal Notes field (Phase 4.5)</w:t>
+      </w:r>
+    </w:p>
+    <w:p>
+      <w:pPr>
+        <w:pStyle w:val="ListParagraph"/>
+        <w:numPr>
+          <w:ilvl w:val="0"/>
+          <w:numId w:val="2"/>
+        </w:numPr>
+        <w:spacing w:after="80" w:before="0"/>
+      </w:pPr>
+      <w:r>
+        <w:rPr>
+          <w:rFonts w:ascii="Courier New" w:cs="Courier New" w:eastAsia="Courier New" w:hAnsi="Courier New"/>
+          <w:sz w:val="22"/>
+          <w:szCs w:val="22"/>
+        </w:rPr>
+        <w:t xml:space="preserve">PageKeep/Components/PageNumberField.swift</w:t>
+      </w:r>
+      <w:r>
+        <w:rPr>
+          <w:sz w:val="22"/>
+          <w:szCs w:val="22"/>
+        </w:rPr>
+        <w:t xml:space="preserve"> — UIViewRepresentable wrapper for the Page Number field (Phase 4.8)</w:t>
+      </w:r>
+    </w:p>
+    <w:p>
+      <w:pPr>
         <w:pStyle w:val="Heading1"/>
         <w:spacing w:after="180" w:before="360"/>
       </w:pPr>
@@ -1113,6 +1333,57 @@
     </w:p>
     <w:p>
       <w:pPr>
+        <w:spacing w:after="120" w:before="0"/>
+      </w:pPr>
+      <w:r>
+        <w:rPr>
+          <w:b/>
+          <w:bCs/>
+          <w:sz w:val="22"/>
+          <w:szCs w:val="22"/>
+        </w:rPr>
+        <w:t xml:space="preserve">Update during implementation: </w:t>
+      </w:r>
+      <w:r>
+        <w:rPr>
+          <w:sz w:val="22"/>
+          <w:szCs w:val="22"/>
+        </w:rPr>
+        <w:t xml:space="preserve">the SwiftUI </w:t>
+      </w:r>
+      <w:r>
+        <w:rPr>
+          <w:rFonts w:ascii="Courier New" w:cs="Courier New" w:eastAsia="Courier New" w:hAnsi="Courier New"/>
+          <w:sz w:val="22"/>
+          <w:szCs w:val="22"/>
+        </w:rPr>
+        <w:t xml:space="preserve">ToolbarItemGroup(placement: .keyboard)</w:t>
+      </w:r>
+      <w:r>
+        <w:rPr>
+          <w:sz w:val="22"/>
+          <w:szCs w:val="22"/>
+        </w:rPr>
+        <w:t xml:space="preserve"> approach described here was later replaced in Phase 4.8 with a UIKit input accessory attached via the new </w:t>
+      </w:r>
+      <w:r>
+        <w:rPr>
+          <w:rFonts w:ascii="Courier New" w:cs="Courier New" w:eastAsia="Courier New" w:hAnsi="Courier New"/>
+          <w:sz w:val="22"/>
+          <w:szCs w:val="22"/>
+        </w:rPr>
+        <w:t xml:space="preserve">PageNumberField</w:t>
+      </w:r>
+      <w:r>
+        <w:rPr>
+          <w:sz w:val="22"/>
+          <w:szCs w:val="22"/>
+        </w:rPr>
+        <w:t xml:space="preserve"> UIViewRepresentable. The reason is iOS 26 wraps SwiftUI keyboard toolbar items in a glass capsule that produced visual chrome inconsistent with the UIKit-attached accessories on Personal Notes (Phase 4.7) and Quote/Passage (FormattedTextEditor). All three accessories now use the same system Done bar button primitive — see Phase 4.8.</w:t>
+      </w:r>
+    </w:p>
+    <w:p>
+      <w:pPr>
         <w:shd w:fill="E6F1FB" w:val="clear"/>
         <w:spacing w:after="160" w:before="80"/>
       </w:pPr>
@@ -1174,7 +1445,7 @@
           <w:sz w:val="22"/>
           <w:szCs w:val="22"/>
         </w:rPr>
-        <w:t xml:space="preserve"> currently use </w:t>
+        <w:t xml:space="preserve"> previously used </w:t>
       </w:r>
       <w:r>
         <w:rPr>
@@ -1189,7 +1460,7 @@
           <w:sz w:val="22"/>
           <w:szCs w:val="22"/>
         </w:rPr>
-        <w:t xml:space="preserve">. Change to </w:t>
+        <w:t xml:space="preserve">. Changed to </w:t>
       </w:r>
       <w:r>
         <w:rPr>
@@ -1204,7 +1475,7 @@
           <w:sz w:val="22"/>
           <w:szCs w:val="22"/>
         </w:rPr>
-        <w:t xml:space="preserve"> and add a Show More / Show Less toggle below the text — same pattern already used in </w:t>
+        <w:t xml:space="preserve"> with a Show More / Show Less toggle below — same pattern already used in </w:t>
       </w:r>
       <w:r>
         <w:rPr>
@@ -1219,7 +1490,7 @@
           <w:sz w:val="22"/>
           <w:szCs w:val="22"/>
         </w:rPr>
-        <w:t xml:space="preserve"> (lines 97–103). Add a new state variable </w:t>
+        <w:t xml:space="preserve"> (lines 97–103). Added </w:t>
       </w:r>
       <w:r>
         <w:rPr>
@@ -1235,6 +1506,272 @@
           <w:szCs w:val="22"/>
         </w:rPr>
         <w:t xml:space="preserve">.</w:t>
+      </w:r>
+    </w:p>
+    <w:p>
+      <w:pPr>
+        <w:spacing w:after="120" w:before="0"/>
+      </w:pPr>
+      <w:r>
+        <w:rPr>
+          <w:sz w:val="22"/>
+          <w:szCs w:val="22"/>
+        </w:rPr>
+        <w:t xml:space="preserve">Sub-fixes that emerged during device testing:</w:t>
+      </w:r>
+    </w:p>
+    <w:p>
+      <w:pPr>
+        <w:pStyle w:val="ListParagraph"/>
+        <w:numPr>
+          <w:ilvl w:val="0"/>
+          <w:numId w:val="2"/>
+        </w:numPr>
+        <w:spacing w:after="80" w:before="0"/>
+      </w:pPr>
+      <w:r>
+        <w:rPr>
+          <w:b/>
+          <w:bCs/>
+          <w:sz w:val="22"/>
+          <w:szCs w:val="22"/>
+        </w:rPr>
+        <w:t xml:space="preserve">Race condition with book search (commit 6ca9f80): </w:t>
+      </w:r>
+      <w:r>
+        <w:rPr>
+          <w:sz w:val="22"/>
+          <w:szCs w:val="22"/>
+        </w:rPr>
+        <w:t xml:space="preserve">tapping Show More after selecting a book briefly re-triggered the search debounce and reset the description back to truncated. Fixed by adding </w:t>
+      </w:r>
+      <w:r>
+        <w:rPr>
+          <w:rFonts w:ascii="Courier New" w:cs="Courier New" w:eastAsia="Courier New" w:hAnsi="Courier New"/>
+          <w:sz w:val="22"/>
+          <w:szCs w:val="22"/>
+        </w:rPr>
+        <w:t xml:space="preserve">guard selectedBook == nil else { return }</w:t>
+      </w:r>
+      <w:r>
+        <w:rPr>
+          <w:sz w:val="22"/>
+          <w:szCs w:val="22"/>
+        </w:rPr>
+        <w:t xml:space="preserve"> at the top of </w:t>
+      </w:r>
+      <w:r>
+        <w:rPr>
+          <w:rFonts w:ascii="Courier New" w:cs="Courier New" w:eastAsia="Courier New" w:hAnsi="Courier New"/>
+          <w:sz w:val="22"/>
+          <w:szCs w:val="22"/>
+        </w:rPr>
+        <w:t xml:space="preserve">handleSearchChange()</w:t>
+      </w:r>
+      <w:r>
+        <w:rPr>
+          <w:sz w:val="22"/>
+          <w:szCs w:val="22"/>
+        </w:rPr>
+        <w:t xml:space="preserve"> and invalidating </w:t>
+      </w:r>
+      <w:r>
+        <w:rPr>
+          <w:rFonts w:ascii="Courier New" w:cs="Courier New" w:eastAsia="Courier New" w:hAnsi="Courier New"/>
+          <w:sz w:val="22"/>
+          <w:szCs w:val="22"/>
+        </w:rPr>
+        <w:t xml:space="preserve">searchTimer</w:t>
+      </w:r>
+      <w:r>
+        <w:rPr>
+          <w:sz w:val="22"/>
+          <w:szCs w:val="22"/>
+        </w:rPr>
+        <w:t xml:space="preserve"> at the start of </w:t>
+      </w:r>
+      <w:r>
+        <w:rPr>
+          <w:rFonts w:ascii="Courier New" w:cs="Courier New" w:eastAsia="Courier New" w:hAnsi="Courier New"/>
+          <w:sz w:val="22"/>
+          <w:szCs w:val="22"/>
+        </w:rPr>
+        <w:t xml:space="preserve">selectBook()</w:t>
+      </w:r>
+      <w:r>
+        <w:rPr>
+          <w:sz w:val="22"/>
+          <w:szCs w:val="22"/>
+        </w:rPr>
+        <w:t xml:space="preserve">.</w:t>
+      </w:r>
+    </w:p>
+    <w:p>
+      <w:pPr>
+        <w:pStyle w:val="ListParagraph"/>
+        <w:numPr>
+          <w:ilvl w:val="0"/>
+          <w:numId w:val="2"/>
+        </w:numPr>
+        <w:spacing w:after="80" w:before="0"/>
+      </w:pPr>
+      <w:r>
+        <w:rPr>
+          <w:b/>
+          <w:bCs/>
+          <w:sz w:val="22"/>
+          <w:szCs w:val="22"/>
+        </w:rPr>
+        <w:t xml:space="preserve">Form gesture eating the Show More tap (commit fa3ce3e): </w:t>
+      </w:r>
+      <w:r>
+        <w:rPr>
+          <w:sz w:val="22"/>
+          <w:szCs w:val="22"/>
+        </w:rPr>
+        <w:t xml:space="preserve">the </w:t>
+      </w:r>
+      <w:r>
+        <w:rPr>
+          <w:rFonts w:ascii="Courier New" w:cs="Courier New" w:eastAsia="Courier New" w:hAnsi="Courier New"/>
+          <w:sz w:val="22"/>
+          <w:szCs w:val="22"/>
+        </w:rPr>
+        <w:t xml:space="preserve">.onTapGesture</w:t>
+      </w:r>
+      <w:r>
+        <w:rPr>
+          <w:sz w:val="22"/>
+          <w:szCs w:val="22"/>
+        </w:rPr>
+        <w:t xml:space="preserve"> on the Form (added in Phase 4.1's Add Book counterpart) intercepted the Button's tap. Fixed by changing to </w:t>
+      </w:r>
+      <w:r>
+        <w:rPr>
+          <w:rFonts w:ascii="Courier New" w:cs="Courier New" w:eastAsia="Courier New" w:hAnsi="Courier New"/>
+          <w:sz w:val="22"/>
+          <w:szCs w:val="22"/>
+        </w:rPr>
+        <w:t xml:space="preserve">.simultaneousGesture(TapGesture().onEnded { ... })</w:t>
+      </w:r>
+      <w:r>
+        <w:rPr>
+          <w:sz w:val="22"/>
+          <w:szCs w:val="22"/>
+        </w:rPr>
+        <w:t xml:space="preserve"> so parent and child gestures both fire. (Note: this same pattern did NOT work for the Add Annotation genre Picker — see Phase 4.6.)</w:t>
+      </w:r>
+    </w:p>
+    <w:p>
+      <w:pPr>
+        <w:pStyle w:val="ListParagraph"/>
+        <w:numPr>
+          <w:ilvl w:val="0"/>
+          <w:numId w:val="2"/>
+        </w:numPr>
+        <w:spacing w:after="80" w:before="0"/>
+      </w:pPr>
+      <w:r>
+        <w:rPr>
+          <w:b/>
+          <w:bCs/>
+          <w:sz w:val="22"/>
+          <w:szCs w:val="22"/>
+        </w:rPr>
+        <w:t xml:space="preserve">Hit-area bleeding into description text (commit 1d3e597): </w:t>
+      </w:r>
+      <w:r>
+        <w:rPr>
+          <w:sz w:val="22"/>
+          <w:szCs w:val="22"/>
+        </w:rPr>
+        <w:t xml:space="preserve">iOS's 44pt minimum tap target made the Show More Button capture taps that landed on description text near the button. Fixed by adding </w:t>
+      </w:r>
+      <w:r>
+        <w:rPr>
+          <w:rFonts w:ascii="Courier New" w:cs="Courier New" w:eastAsia="Courier New" w:hAnsi="Courier New"/>
+          <w:sz w:val="22"/>
+          <w:szCs w:val="22"/>
+        </w:rPr>
+        <w:t xml:space="preserve">.contentShape(Rectangle())</w:t>
+      </w:r>
+      <w:r>
+        <w:rPr>
+          <w:sz w:val="22"/>
+          <w:szCs w:val="22"/>
+        </w:rPr>
+        <w:t xml:space="preserve"> on the Text label, </w:t>
+      </w:r>
+      <w:r>
+        <w:rPr>
+          <w:rFonts w:ascii="Courier New" w:cs="Courier New" w:eastAsia="Courier New" w:hAnsi="Courier New"/>
+          <w:sz w:val="22"/>
+          <w:szCs w:val="22"/>
+        </w:rPr>
+        <w:t xml:space="preserve">.buttonStyle(.plain)</w:t>
+      </w:r>
+      <w:r>
+        <w:rPr>
+          <w:sz w:val="22"/>
+          <w:szCs w:val="22"/>
+        </w:rPr>
+        <w:t xml:space="preserve"> on the Button, and </w:t>
+      </w:r>
+      <w:r>
+        <w:rPr>
+          <w:rFonts w:ascii="Courier New" w:cs="Courier New" w:eastAsia="Courier New" w:hAnsi="Courier New"/>
+          <w:sz w:val="22"/>
+          <w:szCs w:val="22"/>
+        </w:rPr>
+        <w:t xml:space="preserve">.padding(.top, 4)</w:t>
+      </w:r>
+      <w:r>
+        <w:rPr>
+          <w:sz w:val="22"/>
+          <w:szCs w:val="22"/>
+        </w:rPr>
+        <w:t xml:space="preserve"> to give the Button its own breathing room.</w:t>
+      </w:r>
+    </w:p>
+    <w:p>
+      <w:pPr>
+        <w:pStyle w:val="ListParagraph"/>
+        <w:numPr>
+          <w:ilvl w:val="0"/>
+          <w:numId w:val="2"/>
+        </w:numPr>
+        <w:spacing w:after="80" w:before="0"/>
+      </w:pPr>
+      <w:r>
+        <w:rPr>
+          <w:b/>
+          <w:bCs/>
+          <w:sz w:val="22"/>
+          <w:szCs w:val="22"/>
+        </w:rPr>
+        <w:t xml:space="preserve">Crossfade animation glitch (commit 86b90c6): </w:t>
+      </w:r>
+      <w:r>
+        <w:rPr>
+          <w:sz w:val="22"/>
+          <w:szCs w:val="22"/>
+        </w:rPr>
+        <w:t xml:space="preserve">toggling between Show More and Show Less briefly displayed both labels superimposed during the default SwiftUI text crossfade. Fixed with </w:t>
+      </w:r>
+      <w:r>
+        <w:rPr>
+          <w:rFonts w:ascii="Courier New" w:cs="Courier New" w:eastAsia="Courier New" w:hAnsi="Courier New"/>
+          <w:sz w:val="22"/>
+          <w:szCs w:val="22"/>
+        </w:rPr>
+        <w:t xml:space="preserve">.animation(nil, value: showingFullDescription)</w:t>
+      </w:r>
+      <w:r>
+        <w:rPr>
+          <w:sz w:val="22"/>
+          <w:szCs w:val="22"/>
+        </w:rPr>
+        <w:t xml:space="preserve"> on the label.</w:t>
       </w:r>
     </w:p>
     <w:p>
@@ -1261,7 +1798,7 @@
           <w:sz w:val="22"/>
           <w:szCs w:val="22"/>
         </w:rPr>
-        <w:t xml:space="preserve">Add a new section to </w:t>
+        <w:t xml:space="preserve">Added a new section to </w:t>
       </w:r>
       <w:r>
         <w:rPr>
@@ -1276,7 +1813,7 @@
           <w:sz w:val="22"/>
           <w:szCs w:val="22"/>
         </w:rPr>
-        <w:t xml:space="preserve"> after the Reading Progress section (after line 285). The button should match the styling of the Add Annotation button in </w:t>
+        <w:t xml:space="preserve"> after the Reading Progress section (commit f91145f). Button matches the Add Annotation button styling in </w:t>
       </w:r>
       <w:r>
         <w:rPr>
@@ -1291,7 +1828,7 @@
           <w:sz w:val="22"/>
           <w:szCs w:val="22"/>
         </w:rPr>
-        <w:t xml:space="preserve"> (lines 259–272): full width, blue background, white text, padded, rounded corners. Label: </w:t>
+        <w:t xml:space="preserve">: full width, blue background, white text, padded, rounded corners. Label is </w:t>
       </w:r>
       <w:r>
         <w:rPr>
@@ -1307,7 +1844,7 @@
           <w:sz w:val="22"/>
           <w:szCs w:val="22"/>
         </w:rPr>
-        <w:t xml:space="preserve">. The handler calls the existing </w:t>
+        <w:t xml:space="preserve">. Handler calls the existing </w:t>
       </w:r>
       <w:r>
         <w:rPr>
@@ -1322,7 +1859,161 @@
           <w:sz w:val="22"/>
           <w:szCs w:val="22"/>
         </w:rPr>
-        <w:t xml:space="preserve"> function — same path as the toolbar Add button. Keep the toolbar Add button in place.</w:t>
+        <w:t xml:space="preserve"> function. Toolbar Add button remains in place. Disabled state is wired via </w:t>
+      </w:r>
+      <w:r>
+        <w:rPr>
+          <w:rFonts w:ascii="Courier New" w:cs="Courier New" w:eastAsia="Courier New" w:hAnsi="Courier New"/>
+          <w:sz w:val="22"/>
+          <w:szCs w:val="22"/>
+        </w:rPr>
+        <w:t xml:space="preserve">.disabled(!canSave)</w:t>
+      </w:r>
+      <w:r>
+        <w:rPr>
+          <w:sz w:val="22"/>
+          <w:szCs w:val="22"/>
+        </w:rPr>
+        <w:t xml:space="preserve"> and the row uses </w:t>
+      </w:r>
+      <w:r>
+        <w:rPr>
+          <w:rFonts w:ascii="Courier New" w:cs="Courier New" w:eastAsia="Courier New" w:hAnsi="Courier New"/>
+          <w:sz w:val="22"/>
+          <w:szCs w:val="22"/>
+        </w:rPr>
+        <w:t xml:space="preserve">.listRowBackground(Color.clear)</w:t>
+      </w:r>
+      <w:r>
+        <w:rPr>
+          <w:sz w:val="22"/>
+          <w:szCs w:val="22"/>
+        </w:rPr>
+        <w:t xml:space="preserve"> so the form section background doesn't show.</w:t>
+      </w:r>
+    </w:p>
+    <w:p>
+      <w:pPr>
+        <w:spacing w:after="120" w:before="0"/>
+      </w:pPr>
+      <w:r>
+        <w:rPr>
+          <w:sz w:val="22"/>
+          <w:szCs w:val="22"/>
+        </w:rPr>
+        <w:t xml:space="preserve">Sub-fixes that emerged during device testing:</w:t>
+      </w:r>
+    </w:p>
+    <w:p>
+      <w:pPr>
+        <w:pStyle w:val="ListParagraph"/>
+        <w:numPr>
+          <w:ilvl w:val="0"/>
+          <w:numId w:val="2"/>
+        </w:numPr>
+        <w:spacing w:after="80" w:before="0"/>
+      </w:pPr>
+      <w:r>
+        <w:rPr>
+          <w:b/>
+          <w:bCs/>
+          <w:sz w:val="22"/>
+          <w:szCs w:val="22"/>
+        </w:rPr>
+        <w:t xml:space="preserve">Disabled state visually identical to enabled (commit ef67c89): </w:t>
+      </w:r>
+      <w:r>
+        <w:rPr>
+          <w:sz w:val="22"/>
+          <w:szCs w:val="22"/>
+        </w:rPr>
+        <w:t xml:space="preserve">the button stayed solid blue even when </w:t>
+      </w:r>
+      <w:r>
+        <w:rPr>
+          <w:rFonts w:ascii="Courier New" w:cs="Courier New" w:eastAsia="Courier New" w:hAnsi="Courier New"/>
+          <w:sz w:val="22"/>
+          <w:szCs w:val="22"/>
+        </w:rPr>
+        <w:t xml:space="preserve">canSave</w:t>
+      </w:r>
+      <w:r>
+        <w:rPr>
+          <w:sz w:val="22"/>
+          <w:szCs w:val="22"/>
+        </w:rPr>
+        <w:t xml:space="preserve"> was false, giving no visual cue. Fixed by changing the background from a constant </w:t>
+      </w:r>
+      <w:r>
+        <w:rPr>
+          <w:rFonts w:ascii="Courier New" w:cs="Courier New" w:eastAsia="Courier New" w:hAnsi="Courier New"/>
+          <w:sz w:val="22"/>
+          <w:szCs w:val="22"/>
+        </w:rPr>
+        <w:t xml:space="preserve">Color.blue</w:t>
+      </w:r>
+      <w:r>
+        <w:rPr>
+          <w:sz w:val="22"/>
+          <w:szCs w:val="22"/>
+        </w:rPr>
+        <w:t xml:space="preserve"> to </w:t>
+      </w:r>
+      <w:r>
+        <w:rPr>
+          <w:rFonts w:ascii="Courier New" w:cs="Courier New" w:eastAsia="Courier New" w:hAnsi="Courier New"/>
+          <w:sz w:val="22"/>
+          <w:szCs w:val="22"/>
+        </w:rPr>
+        <w:t xml:space="preserve">canSave ? Color.blue : Color.gray</w:t>
+      </w:r>
+      <w:r>
+        <w:rPr>
+          <w:sz w:val="22"/>
+          <w:szCs w:val="22"/>
+        </w:rPr>
+        <w:t xml:space="preserve">.</w:t>
+      </w:r>
+    </w:p>
+    <w:p>
+      <w:pPr>
+        <w:pStyle w:val="ListParagraph"/>
+        <w:numPr>
+          <w:ilvl w:val="0"/>
+          <w:numId w:val="2"/>
+        </w:numPr>
+        <w:spacing w:after="80" w:before="0"/>
+      </w:pPr>
+      <w:r>
+        <w:rPr>
+          <w:b/>
+          <w:bCs/>
+          <w:sz w:val="22"/>
+          <w:szCs w:val="22"/>
+        </w:rPr>
+        <w:t xml:space="preserve">Required multi-tap to register (commit ef67c89): </w:t>
+      </w:r>
+      <w:r>
+        <w:rPr>
+          <w:sz w:val="22"/>
+          <w:szCs w:val="22"/>
+        </w:rPr>
+        <w:t xml:space="preserve">first tap selected the row, second tap fired the action. Fixed by adding </w:t>
+      </w:r>
+      <w:r>
+        <w:rPr>
+          <w:rFonts w:ascii="Courier New" w:cs="Courier New" w:eastAsia="Courier New" w:hAnsi="Courier New"/>
+          <w:sz w:val="22"/>
+          <w:szCs w:val="22"/>
+        </w:rPr>
+        <w:t xml:space="preserve">.buttonStyle(.plain)</w:t>
+      </w:r>
+      <w:r>
+        <w:rPr>
+          <w:sz w:val="22"/>
+          <w:szCs w:val="22"/>
+        </w:rPr>
+        <w:t xml:space="preserve"> so the Button claims the entire tap on first contact.</w:t>
       </w:r>
     </w:p>
     <w:p>
@@ -1361,31 +2052,211 @@
           <w:sz w:val="22"/>
           <w:szCs w:val="22"/>
         </w:rPr>
-        <w:t xml:space="preserve">4.5 Fix autocorrect interfering with capitalization on Add Annotation fields</w:t>
-      </w:r>
-    </w:p>
-    <w:p>
-      <w:pPr>
-        <w:spacing w:after="120" w:before="0"/>
-      </w:pPr>
-      <w:r>
-        <w:rPr>
-          <w:sz w:val="22"/>
-          <w:szCs w:val="22"/>
-        </w:rPr>
-        <w:t xml:space="preserve">Bug discovered during Phase 4.1 testing: typing the first word of either the Quote or Personal Notes field and pressing space sometimes lower-cases the first letter even when the shift indicator was on. Root cause is iOS autocorrect replacing the perceived typo and changing case in the process. Neither field has explicit text-input behavior set, so they inherit aggressive UIKit defaults. Fix is to disable autocorrect on these specific fields while keeping sentence-capitalization on. Spell-check (red underlines) stays on — only the auto-replacement behavior is removed.</w:t>
-      </w:r>
-    </w:p>
-    <w:p>
-      <w:pPr>
-        <w:spacing w:after="120" w:before="0"/>
-      </w:pPr>
-      <w:r>
-        <w:rPr>
-          <w:sz w:val="22"/>
-          <w:szCs w:val="22"/>
-        </w:rPr>
-        <w:t xml:space="preserve">In </w:t>
+        <w:t xml:space="preserve">4.5 Capitalization, spell-check, and word-wrap on Personal Notes / Quote</w:t>
+      </w:r>
+    </w:p>
+    <w:p>
+      <w:pPr>
+        <w:spacing w:after="120" w:before="0"/>
+      </w:pPr>
+      <w:r>
+        <w:rPr>
+          <w:sz w:val="22"/>
+          <w:szCs w:val="22"/>
+        </w:rPr>
+        <w:t xml:space="preserve">Bug discovered during Phase 4.1 testing: typing the first word of either the Quote or Personal Notes field and pressing space sometimes lower-cases the first letter even when the shift indicator was on. Root cause is iOS autocorrect replacing the perceived typo and changing case in the process. The needed combination is sentence-capitalization on, autocorrect off, spell-check on — but Personal Notes was a SwiftUI TextField at the time, and SwiftUI does not expose all three traits independently.</w:t>
+      </w:r>
+    </w:p>
+    <w:p>
+      <w:pPr>
+        <w:spacing w:after="120" w:before="0"/>
+      </w:pPr>
+      <w:r>
+        <w:rPr>
+          <w:sz w:val="22"/>
+          <w:szCs w:val="22"/>
+        </w:rPr>
+        <w:t xml:space="preserve">Multiple lighter approaches were attempted and abandoned:</w:t>
+      </w:r>
+    </w:p>
+    <w:p>
+      <w:pPr>
+        <w:pStyle w:val="ListParagraph"/>
+        <w:numPr>
+          <w:ilvl w:val="0"/>
+          <w:numId w:val="2"/>
+        </w:numPr>
+        <w:spacing w:after="80" w:before="0"/>
+      </w:pPr>
+      <w:r>
+        <w:rPr>
+          <w:sz w:val="22"/>
+          <w:szCs w:val="22"/>
+        </w:rPr>
+        <w:t xml:space="preserve">SwiftUI .textInputAutocapitalization(.sentences) + .autocorrectionDisabled(true) modifiers — autocapitalization is ignored on TextField(axis: .vertical) under iOS 26's SwiftUI internals.</w:t>
+      </w:r>
+    </w:p>
+    <w:p>
+      <w:pPr>
+        <w:pStyle w:val="ListParagraph"/>
+        <w:numPr>
+          <w:ilvl w:val="0"/>
+          <w:numId w:val="2"/>
+        </w:numPr>
+        <w:spacing w:after="80" w:before="0"/>
+      </w:pPr>
+      <w:r>
+        <w:rPr>
+          <w:sz w:val="22"/>
+          <w:szCs w:val="22"/>
+        </w:rPr>
+        <w:t xml:space="preserve">UIKit appearance proxy (</w:t>
+      </w:r>
+      <w:r>
+        <w:rPr>
+          <w:rFonts w:ascii="Courier New" w:cs="Courier New" w:eastAsia="Courier New" w:hAnsi="Courier New"/>
+          <w:sz w:val="22"/>
+          <w:szCs w:val="22"/>
+        </w:rPr>
+        <w:t xml:space="preserve">UITextView.appearance().spellCheckingType = .yes</w:t>
+      </w:r>
+      <w:r>
+        <w:rPr>
+          <w:sz w:val="22"/>
+          <w:szCs w:val="22"/>
+        </w:rPr>
+        <w:t xml:space="preserve">) — crashed on </w:t>
+      </w:r>
+      <w:r>
+        <w:rPr>
+          <w:rFonts w:ascii="Courier New" w:cs="Courier New" w:eastAsia="Courier New" w:hAnsi="Courier New"/>
+          <w:sz w:val="22"/>
+          <w:szCs w:val="22"/>
+        </w:rPr>
+        <w:t xml:space="preserve">SwiftUI.VerticalTextView</w:t>
+      </w:r>
+      <w:r>
+        <w:rPr>
+          <w:sz w:val="22"/>
+          <w:szCs w:val="22"/>
+        </w:rPr>
+        <w:t xml:space="preserve"> with NSInternalInconsistencyException.</w:t>
+      </w:r>
+    </w:p>
+    <w:p>
+      <w:pPr>
+        <w:spacing w:after="120" w:before="0"/>
+      </w:pPr>
+      <w:r>
+        <w:rPr>
+          <w:sz w:val="22"/>
+          <w:szCs w:val="22"/>
+        </w:rPr>
+        <w:t xml:space="preserve">Final implementation:</w:t>
+      </w:r>
+    </w:p>
+    <w:p>
+      <w:pPr>
+        <w:pStyle w:val="ListParagraph"/>
+        <w:numPr>
+          <w:ilvl w:val="0"/>
+          <w:numId w:val="2"/>
+        </w:numPr>
+        <w:spacing w:after="80" w:before="0"/>
+      </w:pPr>
+      <w:r>
+        <w:rPr>
+          <w:sz w:val="22"/>
+          <w:szCs w:val="22"/>
+        </w:rPr>
+        <w:t xml:space="preserve">Created </w:t>
+      </w:r>
+      <w:r>
+        <w:rPr>
+          <w:rFonts w:ascii="Courier New" w:cs="Courier New" w:eastAsia="Courier New" w:hAnsi="Courier New"/>
+          <w:sz w:val="22"/>
+          <w:szCs w:val="22"/>
+        </w:rPr>
+        <w:t xml:space="preserve">PageKeep/Components/PersonalNotesEditor.swift</w:t>
+      </w:r>
+      <w:r>
+        <w:rPr>
+          <w:sz w:val="22"/>
+          <w:szCs w:val="22"/>
+        </w:rPr>
+        <w:t xml:space="preserve"> — a UIViewRepresentable wrapping UITextView. Sets </w:t>
+      </w:r>
+      <w:r>
+        <w:rPr>
+          <w:rFonts w:ascii="Courier New" w:cs="Courier New" w:eastAsia="Courier New" w:hAnsi="Courier New"/>
+          <w:sz w:val="22"/>
+          <w:szCs w:val="22"/>
+        </w:rPr>
+        <w:t xml:space="preserve">autocapitalizationType = .sentences</w:t>
+      </w:r>
+      <w:r>
+        <w:rPr>
+          <w:sz w:val="22"/>
+          <w:szCs w:val="22"/>
+        </w:rPr>
+        <w:t xml:space="preserve">, </w:t>
+      </w:r>
+      <w:r>
+        <w:rPr>
+          <w:rFonts w:ascii="Courier New" w:cs="Courier New" w:eastAsia="Courier New" w:hAnsi="Courier New"/>
+          <w:sz w:val="22"/>
+          <w:szCs w:val="22"/>
+        </w:rPr>
+        <w:t xml:space="preserve">autocorrectionType = .no</w:t>
+      </w:r>
+      <w:r>
+        <w:rPr>
+          <w:sz w:val="22"/>
+          <w:szCs w:val="22"/>
+        </w:rPr>
+        <w:t xml:space="preserve">, </w:t>
+      </w:r>
+      <w:r>
+        <w:rPr>
+          <w:rFonts w:ascii="Courier New" w:cs="Courier New" w:eastAsia="Courier New" w:hAnsi="Courier New"/>
+          <w:sz w:val="22"/>
+          <w:szCs w:val="22"/>
+        </w:rPr>
+        <w:t xml:space="preserve">spellCheckingType = .yes</w:t>
+      </w:r>
+      <w:r>
+        <w:rPr>
+          <w:sz w:val="22"/>
+          <w:szCs w:val="22"/>
+        </w:rPr>
+        <w:t xml:space="preserve"> directly on the UITextView. Coordinator handles placeholder behavior, focus state, and two-way text binding.</w:t>
+      </w:r>
+    </w:p>
+    <w:p>
+      <w:pPr>
+        <w:spacing w:after="120" w:before="0"/>
+      </w:pPr>
+      <w:r>
+        <w:rPr>
+          <w:sz w:val="22"/>
+          <w:szCs w:val="22"/>
+        </w:rPr>
+        <w:t xml:space="preserve">Replaced the Personal Notes </w:t>
+      </w:r>
+      <w:r>
+        <w:rPr>
+          <w:rFonts w:ascii="Courier New" w:cs="Courier New" w:eastAsia="Courier New" w:hAnsi="Courier New"/>
+          <w:sz w:val="22"/>
+          <w:szCs w:val="22"/>
+        </w:rPr>
+        <w:t xml:space="preserve">TextField</w:t>
+      </w:r>
+      <w:r>
+        <w:rPr>
+          <w:sz w:val="22"/>
+          <w:szCs w:val="22"/>
+        </w:rPr>
+        <w:t xml:space="preserve"> in </w:t>
       </w:r>
       <w:r>
         <w:rPr>
@@ -1400,79 +2271,64 @@
           <w:sz w:val="22"/>
           <w:szCs w:val="22"/>
         </w:rPr>
-        <w:t xml:space="preserve">, on the personal notes </w:t>
-      </w:r>
-      <w:r>
-        <w:rPr>
-          <w:rFonts w:ascii="Courier New" w:cs="Courier New" w:eastAsia="Courier New" w:hAnsi="Courier New"/>
-          <w:sz w:val="22"/>
-          <w:szCs w:val="22"/>
-        </w:rPr>
-        <w:t xml:space="preserve">TextField</w:t>
-      </w:r>
-      <w:r>
-        <w:rPr>
-          <w:sz w:val="22"/>
-          <w:szCs w:val="22"/>
-        </w:rPr>
-        <w:t xml:space="preserve"> (around line 209), add two modifiers after </w:t>
-      </w:r>
-      <w:r>
-        <w:rPr>
-          <w:rFonts w:ascii="Courier New" w:cs="Courier New" w:eastAsia="Courier New" w:hAnsi="Courier New"/>
-          <w:sz w:val="22"/>
-          <w:szCs w:val="22"/>
-        </w:rPr>
-        <w:t xml:space="preserve">.lineLimit(3...6)</w:t>
-      </w:r>
-      <w:r>
-        <w:rPr>
-          <w:sz w:val="22"/>
-          <w:szCs w:val="22"/>
-        </w:rPr>
-        <w:t xml:space="preserve">:</w:t>
-      </w:r>
-    </w:p>
-    <w:p>
-      <w:pPr>
-        <w:shd w:fill="F1EFE8" w:val="clear"/>
-        <w:spacing w:after="120" w:before="60"/>
-      </w:pPr>
-      <w:r>
-        <w:rPr>
-          <w:rFonts w:ascii="Courier New" w:cs="Courier New" w:eastAsia="Courier New" w:hAnsi="Courier New"/>
-          <w:sz w:val="20"/>
-          <w:szCs w:val="20"/>
-        </w:rPr>
-        <w:t xml:space="preserve">.textInputAutocapitalization(.sentences)
-.autocorrectionDisabled(true)</w:t>
-      </w:r>
-    </w:p>
-    <w:p>
-      <w:pPr>
-        <w:spacing w:after="120" w:before="0"/>
-      </w:pPr>
-      <w:r>
-        <w:rPr>
-          <w:sz w:val="22"/>
-          <w:szCs w:val="22"/>
-        </w:rPr>
-        <w:t xml:space="preserve">In </w:t>
-      </w:r>
-      <w:r>
-        <w:rPr>
-          <w:rFonts w:ascii="Courier New" w:cs="Courier New" w:eastAsia="Courier New" w:hAnsi="Courier New"/>
-          <w:sz w:val="22"/>
-          <w:szCs w:val="22"/>
-        </w:rPr>
-        <w:t xml:space="preserve">FormattedTextEditor.swift</w:t>
-      </w:r>
-      <w:r>
-        <w:rPr>
-          <w:sz w:val="22"/>
-          <w:szCs w:val="22"/>
-        </w:rPr>
-        <w:t xml:space="preserve">, inside </w:t>
+        <w:t xml:space="preserve"> with </w:t>
+      </w:r>
+      <w:r>
+        <w:rPr>
+          <w:rFonts w:ascii="Courier New" w:cs="Courier New" w:eastAsia="Courier New" w:hAnsi="Courier New"/>
+          <w:sz w:val="22"/>
+          <w:szCs w:val="22"/>
+        </w:rPr>
+        <w:t xml:space="preserve">PersonalNotesEditor(text: $personalNotes, placeholder: ...)</w:t>
+      </w:r>
+      <w:r>
+        <w:rPr>
+          <w:sz w:val="22"/>
+          <w:szCs w:val="22"/>
+        </w:rPr>
+        <w:t xml:space="preserve">, framed </w:t>
+      </w:r>
+      <w:r>
+        <w:rPr>
+          <w:rFonts w:ascii="Courier New" w:cs="Courier New" w:eastAsia="Courier New" w:hAnsi="Courier New"/>
+          <w:sz w:val="22"/>
+          <w:szCs w:val="22"/>
+        </w:rPr>
+        <w:t xml:space="preserve">.frame(maxWidth: .infinity, minHeight: 80, maxHeight: 200)</w:t>
+      </w:r>
+      <w:r>
+        <w:rPr>
+          <w:sz w:val="22"/>
+          <w:szCs w:val="22"/>
+        </w:rPr>
+        <w:t xml:space="preserve">.</w:t>
+      </w:r>
+    </w:p>
+    <w:p>
+      <w:pPr>
+        <w:spacing w:after="120" w:before="0"/>
+      </w:pPr>
+      <w:r>
+        <w:rPr>
+          <w:sz w:val="22"/>
+          <w:szCs w:val="22"/>
+        </w:rPr>
+        <w:t xml:space="preserve">For the Quote field, </w:t>
+      </w:r>
+      <w:r>
+        <w:rPr>
+          <w:rFonts w:ascii="Courier New" w:cs="Courier New" w:eastAsia="Courier New" w:hAnsi="Courier New"/>
+          <w:sz w:val="22"/>
+          <w:szCs w:val="22"/>
+        </w:rPr>
+        <w:t xml:space="preserve">FormattedTextEditor</w:t>
+      </w:r>
+      <w:r>
+        <w:rPr>
+          <w:sz w:val="22"/>
+          <w:szCs w:val="22"/>
+        </w:rPr>
+        <w:t xml:space="preserve"> is already a UIViewRepresentable wrapping UITextView, so the same three trait lines were added inline in its </w:t>
       </w:r>
       <w:r>
         <w:rPr>
@@ -1487,7 +2343,7 @@
           <w:sz w:val="22"/>
           <w:szCs w:val="22"/>
         </w:rPr>
-        <w:t xml:space="preserve"> (around line 35, after </w:t>
+        <w:t xml:space="preserve"> (around line 36, after </w:t>
       </w:r>
       <w:r>
         <w:rPr>
@@ -1502,64 +2358,19 @@
           <w:sz w:val="22"/>
           <w:szCs w:val="22"/>
         </w:rPr>
-        <w:t xml:space="preserve">), add two lines:</w:t>
-      </w:r>
-    </w:p>
-    <w:p>
-      <w:pPr>
-        <w:shd w:fill="F1EFE8" w:val="clear"/>
-        <w:spacing w:after="120" w:before="60"/>
-      </w:pPr>
-      <w:r>
-        <w:rPr>
-          <w:rFonts w:ascii="Courier New" w:cs="Courier New" w:eastAsia="Courier New" w:hAnsi="Courier New"/>
-          <w:sz w:val="20"/>
-          <w:szCs w:val="20"/>
-        </w:rPr>
-        <w:t xml:space="preserve">textView.autocapitalizationType = .sentences
-textView.autocorrectionType = .no</w:t>
-      </w:r>
-    </w:p>
-    <w:p>
-      <w:pPr>
-        <w:spacing w:after="120" w:before="0"/>
-      </w:pPr>
-      <w:r>
-        <w:rPr>
-          <w:sz w:val="22"/>
-          <w:szCs w:val="22"/>
-        </w:rPr>
-        <w:t xml:space="preserve">Do not touch </w:t>
-      </w:r>
-      <w:r>
-        <w:rPr>
-          <w:rFonts w:ascii="Courier New" w:cs="Courier New" w:eastAsia="Courier New" w:hAnsi="Courier New"/>
-          <w:sz w:val="22"/>
-          <w:szCs w:val="22"/>
-        </w:rPr>
-        <w:t xml:space="preserve">spellCheckingType</w:t>
-      </w:r>
-      <w:r>
-        <w:rPr>
-          <w:sz w:val="22"/>
-          <w:szCs w:val="22"/>
-        </w:rPr>
-        <w:t xml:space="preserve"> — its default is correct, the red-underline spell check should stay on. Do not apply this to the page number field — </w:t>
-      </w:r>
-      <w:r>
-        <w:rPr>
-          <w:rFonts w:ascii="Courier New" w:cs="Courier New" w:eastAsia="Courier New" w:hAnsi="Courier New"/>
-          <w:sz w:val="22"/>
-          <w:szCs w:val="22"/>
-        </w:rPr>
-        <w:t xml:space="preserve">.numberPad</w:t>
-      </w:r>
-      <w:r>
-        <w:rPr>
-          <w:sz w:val="22"/>
-          <w:szCs w:val="22"/>
-        </w:rPr>
-        <w:t xml:space="preserve"> ignores these properties.</w:t>
+        <w:t xml:space="preserve">).</w:t>
+      </w:r>
+    </w:p>
+    <w:p>
+      <w:pPr>
+        <w:spacing w:after="120" w:before="0"/>
+      </w:pPr>
+      <w:r>
+        <w:rPr>
+          <w:sz w:val="22"/>
+          <w:szCs w:val="22"/>
+        </w:rPr>
+        <w:t xml:space="preserve">Sub-fix during testing: long unbroken text in Personal Notes overflowed horizontally past the right edge of the box. Root cause was UITextView's intrinsic content size growing horizontally when isScrollEnabled was false. Fix: set isScrollEnabled = true (matching FormattedTextEditor's setup) so SwiftUI's .frame on the wrapper is the source of truth for size and the text container wraps content at the rendered width.</w:t>
       </w:r>
     </w:p>
     <w:p>
@@ -1583,7 +2394,7 @@
           <w:sz w:val="22"/>
           <w:szCs w:val="22"/>
         </w:rPr>
-        <w:t xml:space="preserve">The keyboard's shift behavior on Add Annotation now respects what you actually typed. The first letter of a sentence still auto-capitalizes, but autocorrect no longer replaces words and inadvertently lowers the case. Misspelled words still get red underlines.</w:t>
+        <w:t xml:space="preserve">The keyboard's shift behavior on Add Annotation now respects what you actually typed. Autocorrect no longer replaces words and inadvertently lowers the case. Misspelled words still get red underlines. Long lines in Personal Notes wrap correctly at the right edge.</w:t>
       </w:r>
     </w:p>
     <w:p>
@@ -1610,19 +2421,19 @@
           <w:sz w:val="22"/>
           <w:szCs w:val="22"/>
         </w:rPr>
-        <w:t xml:space="preserve">Regression discovered after Phase 4.1 landed. The three tap-to-dismiss modifiers added to the Form in AddAnnotationView.swift intercept taps on the genre Picker (Genre &amp; Color section), so the dropdown will not open and the user cannot switch which color palette is shown. The individual color circles inside AnnotationGenreColorPicker still work because they are explicit Button views with stronger gesture priority that override the parent tap. Anything that relies on default SwiftUI tap behavior — such as Picker opening its menu — is blocked by the parent .onTapGesture.</w:t>
-      </w:r>
-    </w:p>
-    <w:p>
-      <w:pPr>
-        <w:spacing w:after="120" w:before="0"/>
-      </w:pPr>
-      <w:r>
-        <w:rPr>
-          <w:sz w:val="22"/>
-          <w:szCs w:val="22"/>
-        </w:rPr>
-        <w:t xml:space="preserve">Fix: replace </w:t>
+        <w:t xml:space="preserve">Regression discovered after Phase 4.1 landed. The tap-to-dismiss modifiers added to the Form in AddAnnotationView.swift intercept taps on the genre Picker (Genre &amp; Color section), so the dropdown will not open and the user cannot switch which color palette is shown.</w:t>
+      </w:r>
+    </w:p>
+    <w:p>
+      <w:pPr>
+        <w:spacing w:after="120" w:before="0"/>
+      </w:pPr>
+      <w:r>
+        <w:rPr>
+          <w:sz w:val="22"/>
+          <w:szCs w:val="22"/>
+        </w:rPr>
+        <w:t xml:space="preserve">Initial fix attempt: replace </w:t>
       </w:r>
       <w:r>
         <w:rPr>
@@ -1645,14 +2456,41 @@
           <w:sz w:val="22"/>
           <w:szCs w:val="22"/>
         </w:rPr>
-        <w:t xml:space="preserve">.simultaneousGesture</w:t>
-      </w:r>
-      <w:r>
-        <w:rPr>
-          <w:sz w:val="22"/>
-          <w:szCs w:val="22"/>
-        </w:rPr>
-        <w:t xml:space="preserve"> so the parent gesture and the Picker's own tap can both fire. The other two modifiers (</w:t>
+        <w:t xml:space="preserve">.simultaneousGesture(TapGesture().onEnded { ... })</w:t>
+      </w:r>
+      <w:r>
+        <w:rPr>
+          <w:sz w:val="22"/>
+          <w:szCs w:val="22"/>
+        </w:rPr>
+        <w:t xml:space="preserve"> so parent and child gestures can both fire. This worked for Show More on AddBookview but not for the SwiftUI menu-style Picker, which uses internal hit testing that doesn't cooperate with simultaneousGesture priority.</w:t>
+      </w:r>
+    </w:p>
+    <w:p>
+      <w:pPr>
+        <w:spacing w:after="120" w:before="0"/>
+      </w:pPr>
+      <w:r>
+        <w:rPr>
+          <w:sz w:val="22"/>
+          <w:szCs w:val="22"/>
+        </w:rPr>
+        <w:t xml:space="preserve">Final fix: removed both </w:t>
+      </w:r>
+      <w:r>
+        <w:rPr>
+          <w:rFonts w:ascii="Courier New" w:cs="Courier New" w:eastAsia="Courier New" w:hAnsi="Courier New"/>
+          <w:sz w:val="22"/>
+          <w:szCs w:val="22"/>
+        </w:rPr>
+        <w:t xml:space="preserve">.contentShape(Rectangle())</w:t>
+      </w:r>
+      <w:r>
+        <w:rPr>
+          <w:sz w:val="22"/>
+          <w:szCs w:val="22"/>
+        </w:rPr>
+        <w:t xml:space="preserve"> and the gesture modifier from the Form entirely. Page Number's </w:t>
       </w:r>
       <w:r>
         <w:rPr>
@@ -1667,90 +2505,34 @@
           <w:sz w:val="22"/>
           <w:szCs w:val="22"/>
         </w:rPr>
-        <w:t xml:space="preserve"> and </w:t>
-      </w:r>
-      <w:r>
-        <w:rPr>
-          <w:rFonts w:ascii="Courier New" w:cs="Courier New" w:eastAsia="Courier New" w:hAnsi="Courier New"/>
-          <w:sz w:val="22"/>
-          <w:szCs w:val="22"/>
-        </w:rPr>
-        <w:t xml:space="preserve">.contentShape(Rectangle())</w:t>
-      </w:r>
-      <w:r>
-        <w:rPr>
-          <w:sz w:val="22"/>
-          <w:szCs w:val="22"/>
-        </w:rPr>
-        <w:t xml:space="preserve">) stay unchanged.</w:t>
-      </w:r>
-    </w:p>
-    <w:p>
-      <w:pPr>
-        <w:spacing w:after="120" w:before="0"/>
-      </w:pPr>
-      <w:r>
-        <w:rPr>
-          <w:sz w:val="22"/>
-          <w:szCs w:val="22"/>
-        </w:rPr>
-        <w:t xml:space="preserve">Currently:</w:t>
-      </w:r>
-    </w:p>
-    <w:p>
-      <w:pPr>
-        <w:shd w:fill="F1EFE8" w:val="clear"/>
-        <w:spacing w:after="120" w:before="60"/>
-      </w:pPr>
-      <w:r>
-        <w:rPr>
-          <w:rFonts w:ascii="Courier New" w:cs="Courier New" w:eastAsia="Courier New" w:hAnsi="Courier New"/>
-          <w:sz w:val="20"/>
-          <w:szCs w:val="20"/>
-        </w:rPr>
-        <w:t xml:space="preserve">.scrollDismissesKeyboard(.immediately)
-.contentShape(Rectangle())
-.onTapGesture { focusedField = nil }</w:t>
-      </w:r>
-    </w:p>
-    <w:p>
-      <w:pPr>
-        <w:spacing w:after="120" w:before="0"/>
-      </w:pPr>
-      <w:r>
-        <w:rPr>
-          <w:sz w:val="22"/>
-          <w:szCs w:val="22"/>
-        </w:rPr>
-        <w:t xml:space="preserve">Change to:</w:t>
-      </w:r>
-    </w:p>
-    <w:p>
-      <w:pPr>
-        <w:shd w:fill="F1EFE8" w:val="clear"/>
-        <w:spacing w:after="120" w:before="60"/>
-      </w:pPr>
-      <w:r>
-        <w:rPr>
-          <w:rFonts w:ascii="Courier New" w:cs="Courier New" w:eastAsia="Courier New" w:hAnsi="Courier New"/>
-          <w:sz w:val="20"/>
-          <w:szCs w:val="20"/>
-        </w:rPr>
-        <w:t xml:space="preserve">.scrollDismissesKeyboard(.immediately)
-.contentShape(Rectangle())
-.simultaneousGesture(TapGesture().onEnded { focusedField = nil })</w:t>
-      </w:r>
-    </w:p>
-    <w:p>
-      <w:pPr>
-        <w:spacing w:after="120" w:before="0"/>
-      </w:pPr>
-      <w:r>
-        <w:rPr>
-          <w:sz w:val="22"/>
-          <w:szCs w:val="22"/>
-        </w:rPr>
-        <w:t xml:space="preserve">Behavior after the fix: tapping empty form area dismisses the keyboard (unchanged), tapping a text field focuses it (unchanged), tapping the genre Picker now opens the menu AND dismisses any active keyboard, tapping a color circle selects the color AND dismisses any active keyboard. </w:t>
+        <w:t xml:space="preserve"> (added in Phase 4.1) and the keyboard accessory checkmarks (Phases 4.7 and 4.8) provide two clear keyboard-dismissal paths, so the Form-level tap-anywhere-to-dismiss was redundant. The Form now has only </w:t>
+      </w:r>
+      <w:r>
+        <w:rPr>
+          <w:rFonts w:ascii="Courier New" w:cs="Courier New" w:eastAsia="Courier New" w:hAnsi="Courier New"/>
+          <w:sz w:val="22"/>
+          <w:szCs w:val="22"/>
+        </w:rPr>
+        <w:t xml:space="preserve">.scrollDismissesKeyboard(.immediately)</w:t>
+      </w:r>
+      <w:r>
+        <w:rPr>
+          <w:sz w:val="22"/>
+          <w:szCs w:val="22"/>
+        </w:rPr>
+        <w:t xml:space="preserve">.</w:t>
+      </w:r>
+    </w:p>
+    <w:p>
+      <w:pPr>
+        <w:spacing w:after="120" w:before="0"/>
+      </w:pPr>
+      <w:r>
+        <w:rPr>
+          <w:sz w:val="22"/>
+          <w:szCs w:val="22"/>
+        </w:rPr>
+        <w:t xml:space="preserve">Behavior after the fix: tapping the genre Picker opens its menu, tapping color circles selects them, scrolling the form dismisses any active keyboard, the keyboard toolbar checkmark dismisses any active keyboard. </w:t>
       </w:r>
       <w:r>
         <w:rPr>
@@ -1814,6 +2596,686 @@
           <w:szCs w:val="22"/>
         </w:rPr>
         <w:t xml:space="preserve">The genre dropdown on the Add Annotation screen now opens when tapped. Switching genres changes which color palette is shown, as designed.</w:t>
+      </w:r>
+    </w:p>
+    <w:p>
+      <w:pPr>
+        <w:pStyle w:val="Heading3"/>
+        <w:spacing w:after="100" w:before="200"/>
+      </w:pPr>
+      <w:r>
+        <w:rPr>
+          <w:b/>
+          <w:bCs/>
+          <w:sz w:val="22"/>
+          <w:szCs w:val="22"/>
+        </w:rPr>
+        <w:t xml:space="preserve">4.7 Personal Notes keyboard accessory</w:t>
+      </w:r>
+    </w:p>
+    <w:p>
+      <w:pPr>
+        <w:spacing w:after="120" w:before="0"/>
+      </w:pPr>
+      <w:r>
+        <w:rPr>
+          <w:sz w:val="22"/>
+          <w:szCs w:val="22"/>
+        </w:rPr>
+        <w:t xml:space="preserve">Once Personal Notes was migrated from SwiftUI TextField to the UIKit-backed </w:t>
+      </w:r>
+      <w:r>
+        <w:rPr>
+          <w:rFonts w:ascii="Courier New" w:cs="Courier New" w:eastAsia="Courier New" w:hAnsi="Courier New"/>
+          <w:sz w:val="22"/>
+          <w:szCs w:val="22"/>
+        </w:rPr>
+        <w:t xml:space="preserve">PersonalNotesEditor</w:t>
+      </w:r>
+      <w:r>
+        <w:rPr>
+          <w:sz w:val="22"/>
+          <w:szCs w:val="22"/>
+        </w:rPr>
+        <w:t xml:space="preserve"> in Phase 4.5, the SwiftUI </w:t>
+      </w:r>
+      <w:r>
+        <w:rPr>
+          <w:rFonts w:ascii="Courier New" w:cs="Courier New" w:eastAsia="Courier New" w:hAnsi="Courier New"/>
+          <w:sz w:val="22"/>
+          <w:szCs w:val="22"/>
+        </w:rPr>
+        <w:t xml:space="preserve">ToolbarItemGroup(placement: .keyboard)</w:t>
+      </w:r>
+      <w:r>
+        <w:rPr>
+          <w:sz w:val="22"/>
+          <w:szCs w:val="22"/>
+        </w:rPr>
+        <w:t xml:space="preserve"> from Phase 4.2 stopped applying to it — SwiftUI's keyboard toolbar fires for SwiftUI-tracked focus only, not for a UITextView that becomes first responder. Without a UIKit-attached accessory, no keyboard toolbar appeared at all when typing in Personal Notes.</w:t>
+      </w:r>
+    </w:p>
+    <w:p>
+      <w:pPr>
+        <w:spacing w:after="120" w:before="0"/>
+      </w:pPr>
+      <w:r>
+        <w:rPr>
+          <w:sz w:val="22"/>
+          <w:szCs w:val="22"/>
+        </w:rPr>
+        <w:t xml:space="preserve">Implementation: in </w:t>
+      </w:r>
+      <w:r>
+        <w:rPr>
+          <w:rFonts w:ascii="Courier New" w:cs="Courier New" w:eastAsia="Courier New" w:hAnsi="Courier New"/>
+          <w:sz w:val="22"/>
+          <w:szCs w:val="22"/>
+        </w:rPr>
+        <w:t xml:space="preserve">PersonalNotesEditor.swift</w:t>
+      </w:r>
+      <w:r>
+        <w:rPr>
+          <w:sz w:val="22"/>
+          <w:szCs w:val="22"/>
+        </w:rPr>
+        <w:t xml:space="preserve">'s </w:t>
+      </w:r>
+      <w:r>
+        <w:rPr>
+          <w:rFonts w:ascii="Courier New" w:cs="Courier New" w:eastAsia="Courier New" w:hAnsi="Courier New"/>
+          <w:sz w:val="22"/>
+          <w:szCs w:val="22"/>
+        </w:rPr>
+        <w:t xml:space="preserve">makeUIView</w:t>
+      </w:r>
+      <w:r>
+        <w:rPr>
+          <w:sz w:val="22"/>
+          <w:szCs w:val="22"/>
+        </w:rPr>
+        <w:t xml:space="preserve">, build a UIToolbar and assign it to </w:t>
+      </w:r>
+      <w:r>
+        <w:rPr>
+          <w:rFonts w:ascii="Courier New" w:cs="Courier New" w:eastAsia="Courier New" w:hAnsi="Courier New"/>
+          <w:sz w:val="22"/>
+          <w:szCs w:val="22"/>
+        </w:rPr>
+        <w:t xml:space="preserve">textView.inputAccessoryView</w:t>
+      </w:r>
+      <w:r>
+        <w:rPr>
+          <w:sz w:val="22"/>
+          <w:szCs w:val="22"/>
+        </w:rPr>
+        <w:t xml:space="preserve">. Toolbar items are flexible space + </w:t>
+      </w:r>
+      <w:r>
+        <w:rPr>
+          <w:rFonts w:ascii="Courier New" w:cs="Courier New" w:eastAsia="Courier New" w:hAnsi="Courier New"/>
+          <w:sz w:val="22"/>
+          <w:szCs w:val="22"/>
+        </w:rPr>
+        <w:t xml:space="preserve">UIBarButtonItem(barButtonSystemItem: .done, target: context.coordinator, action: #selector(Coordinator.dismissKeyboard))</w:t>
+      </w:r>
+      <w:r>
+        <w:rPr>
+          <w:sz w:val="22"/>
+          <w:szCs w:val="22"/>
+        </w:rPr>
+        <w:t xml:space="preserve"> — the same primitive used in </w:t>
+      </w:r>
+      <w:r>
+        <w:rPr>
+          <w:rFonts w:ascii="Courier New" w:cs="Courier New" w:eastAsia="Courier New" w:hAnsi="Courier New"/>
+          <w:sz w:val="22"/>
+          <w:szCs w:val="22"/>
+        </w:rPr>
+        <w:t xml:space="preserve">FormattedTextEditor.swift:69</w:t>
+      </w:r>
+      <w:r>
+        <w:rPr>
+          <w:sz w:val="22"/>
+          <w:szCs w:val="22"/>
+        </w:rPr>
+        <w:t xml:space="preserve">. The Coordinator gains a </w:t>
+      </w:r>
+      <w:r>
+        <w:rPr>
+          <w:rFonts w:ascii="Courier New" w:cs="Courier New" w:eastAsia="Courier New" w:hAnsi="Courier New"/>
+          <w:sz w:val="22"/>
+          <w:szCs w:val="22"/>
+        </w:rPr>
+        <w:t xml:space="preserve">weak var textView: UITextView?</w:t>
+      </w:r>
+      <w:r>
+        <w:rPr>
+          <w:sz w:val="22"/>
+          <w:szCs w:val="22"/>
+        </w:rPr>
+        <w:t xml:space="preserve"> reference and an </w:t>
+      </w:r>
+      <w:r>
+        <w:rPr>
+          <w:rFonts w:ascii="Courier New" w:cs="Courier New" w:eastAsia="Courier New" w:hAnsi="Courier New"/>
+          <w:sz w:val="22"/>
+          <w:szCs w:val="22"/>
+        </w:rPr>
+        <w:t xml:space="preserve">@objc dismissKeyboard()</w:t>
+      </w:r>
+      <w:r>
+        <w:rPr>
+          <w:sz w:val="22"/>
+          <w:szCs w:val="22"/>
+        </w:rPr>
+        <w:t xml:space="preserve"> method that calls </w:t>
+      </w:r>
+      <w:r>
+        <w:rPr>
+          <w:rFonts w:ascii="Courier New" w:cs="Courier New" w:eastAsia="Courier New" w:hAnsi="Courier New"/>
+          <w:sz w:val="22"/>
+          <w:szCs w:val="22"/>
+        </w:rPr>
+        <w:t xml:space="preserve">resignFirstResponder</w:t>
+      </w:r>
+      <w:r>
+        <w:rPr>
+          <w:sz w:val="22"/>
+          <w:szCs w:val="22"/>
+        </w:rPr>
+        <w:t xml:space="preserve"> on it.</w:t>
+      </w:r>
+    </w:p>
+    <w:p>
+      <w:pPr>
+        <w:spacing w:after="120" w:before="0"/>
+      </w:pPr>
+      <w:r>
+        <w:rPr>
+          <w:sz w:val="22"/>
+          <w:szCs w:val="22"/>
+        </w:rPr>
+        <w:t xml:space="preserve">iOS 26 renders the system Done bar button as a Liquid Glass blue circle with a white checkmark in keyboard accessories — visually identical to FormattedTextEditor's accessory.</w:t>
+      </w:r>
+    </w:p>
+    <w:p>
+      <w:pPr>
+        <w:shd w:fill="E6F1FB" w:val="clear"/>
+        <w:spacing w:after="160" w:before="80"/>
+      </w:pPr>
+      <w:r>
+        <w:rPr>
+          <w:b/>
+          <w:bCs/>
+          <w:color w:val="0C447C"/>
+          <w:sz w:val="22"/>
+          <w:szCs w:val="22"/>
+        </w:rPr>
+        <w:t xml:space="preserve">Tester note: </w:t>
+      </w:r>
+      <w:r>
+        <w:rPr>
+          <w:color w:val="0C447C"/>
+          <w:sz w:val="22"/>
+          <w:szCs w:val="22"/>
+        </w:rPr>
+        <w:t xml:space="preserve">Tapping into Personal Notes now shows a keyboard accessory bar with a blue circle checkmark on the right that dismisses the keyboard.</w:t>
+      </w:r>
+    </w:p>
+    <w:p>
+      <w:pPr>
+        <w:pStyle w:val="Heading3"/>
+        <w:spacing w:after="100" w:before="200"/>
+      </w:pPr>
+      <w:r>
+        <w:rPr>
+          <w:b/>
+          <w:bCs/>
+          <w:sz w:val="22"/>
+          <w:szCs w:val="22"/>
+        </w:rPr>
+        <w:t xml:space="preserve">4.8 Unify Page Number keyboard accessory with Personal Notes and Quote</w:t>
+      </w:r>
+    </w:p>
+    <w:p>
+      <w:pPr>
+        <w:spacing w:after="120" w:before="0"/>
+      </w:pPr>
+      <w:r>
+        <w:rPr>
+          <w:sz w:val="22"/>
+          <w:szCs w:val="22"/>
+        </w:rPr>
+        <w:t xml:space="preserve">Goal: every keyboard that opens from Add Annotation should show the same blue circle checkmark accessory. After Phases 4.5 and 4.7, Quote and Personal Notes both used UIKit-attached </w:t>
+      </w:r>
+      <w:r>
+        <w:rPr>
+          <w:rFonts w:ascii="Courier New" w:cs="Courier New" w:eastAsia="Courier New" w:hAnsi="Courier New"/>
+          <w:sz w:val="22"/>
+          <w:szCs w:val="22"/>
+        </w:rPr>
+        <w:t xml:space="preserve">UIBarButtonItem(barButtonSystemItem: .done, ...)</w:t>
+      </w:r>
+      <w:r>
+        <w:rPr>
+          <w:sz w:val="22"/>
+          <w:szCs w:val="22"/>
+        </w:rPr>
+        <w:t xml:space="preserve">, which iOS 26 renders as a Liquid Glass blue circle with white checkmark. Page Number was still using the SwiftUI </w:t>
+      </w:r>
+      <w:r>
+        <w:rPr>
+          <w:rFonts w:ascii="Courier New" w:cs="Courier New" w:eastAsia="Courier New" w:hAnsi="Courier New"/>
+          <w:sz w:val="22"/>
+          <w:szCs w:val="22"/>
+        </w:rPr>
+        <w:t xml:space="preserve">ToolbarItemGroup(placement: .keyboard)</w:t>
+      </w:r>
+      <w:r>
+        <w:rPr>
+          <w:sz w:val="22"/>
+          <w:szCs w:val="22"/>
+        </w:rPr>
+        <w:t xml:space="preserve"> from Phase 4.2, which produced a different visual.</w:t>
+      </w:r>
+    </w:p>
+    <w:p>
+      <w:pPr>
+        <w:spacing w:after="120" w:before="0"/>
+      </w:pPr>
+      <w:r>
+        <w:rPr>
+          <w:sz w:val="22"/>
+          <w:szCs w:val="22"/>
+        </w:rPr>
+        <w:t xml:space="preserve">Several SwiftUI-only attempts to align the visuals were tried and abandoned:</w:t>
+      </w:r>
+    </w:p>
+    <w:p>
+      <w:pPr>
+        <w:pStyle w:val="ListParagraph"/>
+        <w:numPr>
+          <w:ilvl w:val="0"/>
+          <w:numId w:val="2"/>
+        </w:numPr>
+        <w:spacing w:after="80" w:before="0"/>
+      </w:pPr>
+      <w:r>
+        <w:rPr>
+          <w:rFonts w:ascii="Courier New" w:cs="Courier New" w:eastAsia="Courier New" w:hAnsi="Courier New"/>
+          <w:sz w:val="22"/>
+          <w:szCs w:val="22"/>
+        </w:rPr>
+        <w:t xml:space="preserve">.buttonStyle(.glassProminent)</w:t>
+      </w:r>
+      <w:r>
+        <w:rPr>
+          <w:sz w:val="22"/>
+          <w:szCs w:val="22"/>
+        </w:rPr>
+        <w:t xml:space="preserve"> with </w:t>
+      </w:r>
+      <w:r>
+        <w:rPr>
+          <w:rFonts w:ascii="Courier New" w:cs="Courier New" w:eastAsia="Courier New" w:hAnsi="Courier New"/>
+          <w:sz w:val="22"/>
+          <w:szCs w:val="22"/>
+        </w:rPr>
+        <w:t xml:space="preserve">.tint(.blue)</w:t>
+      </w:r>
+      <w:r>
+        <w:rPr>
+          <w:sz w:val="22"/>
+          <w:szCs w:val="22"/>
+        </w:rPr>
+        <w:t xml:space="preserve"> — produced a glass-tinted circle with a blue (not white) checkmark.</w:t>
+      </w:r>
+    </w:p>
+    <w:p>
+      <w:pPr>
+        <w:pStyle w:val="ListParagraph"/>
+        <w:numPr>
+          <w:ilvl w:val="0"/>
+          <w:numId w:val="2"/>
+        </w:numPr>
+        <w:spacing w:after="80" w:before="0"/>
+      </w:pPr>
+      <w:r>
+        <w:rPr>
+          <w:rFonts w:ascii="Courier New" w:cs="Courier New" w:eastAsia="Courier New" w:hAnsi="Courier New"/>
+          <w:sz w:val="22"/>
+          <w:szCs w:val="22"/>
+        </w:rPr>
+        <w:t xml:space="preserve">.buttonStyle(.borderedProminent)</w:t>
+      </w:r>
+      <w:r>
+        <w:rPr>
+          <w:sz w:val="22"/>
+          <w:szCs w:val="22"/>
+        </w:rPr>
+        <w:t xml:space="preserve"> — added a white halo around the blue circle.</w:t>
+      </w:r>
+    </w:p>
+    <w:p>
+      <w:pPr>
+        <w:pStyle w:val="ListParagraph"/>
+        <w:numPr>
+          <w:ilvl w:val="0"/>
+          <w:numId w:val="2"/>
+        </w:numPr>
+        <w:spacing w:after="80" w:before="0"/>
+      </w:pPr>
+      <w:r>
+        <w:rPr>
+          <w:sz w:val="22"/>
+          <w:szCs w:val="22"/>
+        </w:rPr>
+        <w:t xml:space="preserve">Manually composed ZStack with </w:t>
+      </w:r>
+      <w:r>
+        <w:rPr>
+          <w:rFonts w:ascii="Courier New" w:cs="Courier New" w:eastAsia="Courier New" w:hAnsi="Courier New"/>
+          <w:sz w:val="22"/>
+          <w:szCs w:val="22"/>
+        </w:rPr>
+        <w:t xml:space="preserve">Circle().fill(.blue)</w:t>
+      </w:r>
+      <w:r>
+        <w:rPr>
+          <w:sz w:val="22"/>
+          <w:szCs w:val="22"/>
+        </w:rPr>
+        <w:t xml:space="preserve"> + checkmark Image and </w:t>
+      </w:r>
+      <w:r>
+        <w:rPr>
+          <w:rFonts w:ascii="Courier New" w:cs="Courier New" w:eastAsia="Courier New" w:hAnsi="Courier New"/>
+          <w:sz w:val="22"/>
+          <w:szCs w:val="22"/>
+        </w:rPr>
+        <w:t xml:space="preserve">.buttonStyle(.plain)</w:t>
+      </w:r>
+      <w:r>
+        <w:rPr>
+          <w:sz w:val="22"/>
+          <w:szCs w:val="22"/>
+        </w:rPr>
+        <w:t xml:space="preserve"> — iOS 26's keyboard toolbar still wrapped the result in a glass capsule.</w:t>
+      </w:r>
+    </w:p>
+    <w:p>
+      <w:pPr>
+        <w:spacing w:after="120" w:before="0"/>
+      </w:pPr>
+      <w:r>
+        <w:rPr>
+          <w:sz w:val="22"/>
+          <w:szCs w:val="22"/>
+        </w:rPr>
+        <w:t xml:space="preserve">Root cause: iOS 26's SwiftUI ToolbarItemGroup(placement: .keyboard) applies a glass capsule to every item at a layer above any Button styling. Cannot be removed from inside SwiftUI.</w:t>
+      </w:r>
+    </w:p>
+    <w:p>
+      <w:pPr>
+        <w:spacing w:after="120" w:before="0"/>
+      </w:pPr>
+      <w:r>
+        <w:rPr>
+          <w:sz w:val="22"/>
+          <w:szCs w:val="22"/>
+        </w:rPr>
+        <w:t xml:space="preserve">Final implementation:</w:t>
+      </w:r>
+    </w:p>
+    <w:p>
+      <w:pPr>
+        <w:pStyle w:val="ListParagraph"/>
+        <w:numPr>
+          <w:ilvl w:val="0"/>
+          <w:numId w:val="2"/>
+        </w:numPr>
+        <w:spacing w:after="80" w:before="0"/>
+      </w:pPr>
+      <w:r>
+        <w:rPr>
+          <w:sz w:val="22"/>
+          <w:szCs w:val="22"/>
+        </w:rPr>
+        <w:t xml:space="preserve">Created </w:t>
+      </w:r>
+      <w:r>
+        <w:rPr>
+          <w:rFonts w:ascii="Courier New" w:cs="Courier New" w:eastAsia="Courier New" w:hAnsi="Courier New"/>
+          <w:sz w:val="22"/>
+          <w:szCs w:val="22"/>
+        </w:rPr>
+        <w:t xml:space="preserve">PageKeep/Components/PageNumberField.swift</w:t>
+      </w:r>
+      <w:r>
+        <w:rPr>
+          <w:sz w:val="22"/>
+          <w:szCs w:val="22"/>
+        </w:rPr>
+        <w:t xml:space="preserve"> — a UIViewRepresentable wrapping UITextField with </w:t>
+      </w:r>
+      <w:r>
+        <w:rPr>
+          <w:rFonts w:ascii="Courier New" w:cs="Courier New" w:eastAsia="Courier New" w:hAnsi="Courier New"/>
+          <w:sz w:val="22"/>
+          <w:szCs w:val="22"/>
+        </w:rPr>
+        <w:t xml:space="preserve">keyboardType = .numberPad</w:t>
+      </w:r>
+      <w:r>
+        <w:rPr>
+          <w:sz w:val="22"/>
+          <w:szCs w:val="22"/>
+        </w:rPr>
+        <w:t xml:space="preserve">. Its </w:t>
+      </w:r>
+      <w:r>
+        <w:rPr>
+          <w:rFonts w:ascii="Courier New" w:cs="Courier New" w:eastAsia="Courier New" w:hAnsi="Courier New"/>
+          <w:sz w:val="22"/>
+          <w:szCs w:val="22"/>
+        </w:rPr>
+        <w:t xml:space="preserve">inputAccessoryView</w:t>
+      </w:r>
+      <w:r>
+        <w:rPr>
+          <w:sz w:val="22"/>
+          <w:szCs w:val="22"/>
+        </w:rPr>
+        <w:t xml:space="preserve"> is a UIToolbar with a single right-aligned </w:t>
+      </w:r>
+      <w:r>
+        <w:rPr>
+          <w:rFonts w:ascii="Courier New" w:cs="Courier New" w:eastAsia="Courier New" w:hAnsi="Courier New"/>
+          <w:sz w:val="22"/>
+          <w:szCs w:val="22"/>
+        </w:rPr>
+        <w:t xml:space="preserve">UIBarButtonItem(barButtonSystemItem: .done, ...)</w:t>
+      </w:r>
+      <w:r>
+        <w:rPr>
+          <w:sz w:val="22"/>
+          <w:szCs w:val="22"/>
+        </w:rPr>
+        <w:t xml:space="preserve"> — same primitive as the other two fields. Coordinator handles two-way text binding via </w:t>
+      </w:r>
+      <w:r>
+        <w:rPr>
+          <w:rFonts w:ascii="Courier New" w:cs="Courier New" w:eastAsia="Courier New" w:hAnsi="Courier New"/>
+          <w:sz w:val="22"/>
+          <w:szCs w:val="22"/>
+        </w:rPr>
+        <w:t xml:space="preserve">.editingChanged</w:t>
+      </w:r>
+      <w:r>
+        <w:rPr>
+          <w:sz w:val="22"/>
+          <w:szCs w:val="22"/>
+        </w:rPr>
+        <w:t xml:space="preserve"> target/action and a </w:t>
+      </w:r>
+      <w:r>
+        <w:rPr>
+          <w:rFonts w:ascii="Courier New" w:cs="Courier New" w:eastAsia="Courier New" w:hAnsi="Courier New"/>
+          <w:sz w:val="22"/>
+          <w:szCs w:val="22"/>
+        </w:rPr>
+        <w:t xml:space="preserve">dismissKeyboard</w:t>
+      </w:r>
+      <w:r>
+        <w:rPr>
+          <w:sz w:val="22"/>
+          <w:szCs w:val="22"/>
+        </w:rPr>
+        <w:t xml:space="preserve"> selector.</w:t>
+      </w:r>
+    </w:p>
+    <w:p>
+      <w:pPr>
+        <w:pStyle w:val="ListParagraph"/>
+        <w:numPr>
+          <w:ilvl w:val="0"/>
+          <w:numId w:val="2"/>
+        </w:numPr>
+        <w:spacing w:after="80" w:before="0"/>
+      </w:pPr>
+      <w:r>
+        <w:rPr>
+          <w:sz w:val="22"/>
+          <w:szCs w:val="22"/>
+        </w:rPr>
+        <w:t xml:space="preserve">In </w:t>
+      </w:r>
+      <w:r>
+        <w:rPr>
+          <w:rFonts w:ascii="Courier New" w:cs="Courier New" w:eastAsia="Courier New" w:hAnsi="Courier New"/>
+          <w:sz w:val="22"/>
+          <w:szCs w:val="22"/>
+        </w:rPr>
+        <w:t xml:space="preserve">AddAnnotationView.swift</w:t>
+      </w:r>
+      <w:r>
+        <w:rPr>
+          <w:sz w:val="22"/>
+          <w:szCs w:val="22"/>
+        </w:rPr>
+        <w:t xml:space="preserve">, replaced the SwiftUI </w:t>
+      </w:r>
+      <w:r>
+        <w:rPr>
+          <w:rFonts w:ascii="Courier New" w:cs="Courier New" w:eastAsia="Courier New" w:hAnsi="Courier New"/>
+          <w:sz w:val="22"/>
+          <w:szCs w:val="22"/>
+        </w:rPr>
+        <w:t xml:space="preserve">TextField("Page Number", text: $pageNumber).keyboardType(.numberPad)</w:t>
+      </w:r>
+      <w:r>
+        <w:rPr>
+          <w:sz w:val="22"/>
+          <w:szCs w:val="22"/>
+        </w:rPr>
+        <w:t xml:space="preserve"> with </w:t>
+      </w:r>
+      <w:r>
+        <w:rPr>
+          <w:rFonts w:ascii="Courier New" w:cs="Courier New" w:eastAsia="Courier New" w:hAnsi="Courier New"/>
+          <w:sz w:val="22"/>
+          <w:szCs w:val="22"/>
+        </w:rPr>
+        <w:t xml:space="preserve">PageNumberField(text: $pageNumber, placeholder: "Page Number")</w:t>
+      </w:r>
+      <w:r>
+        <w:rPr>
+          <w:sz w:val="22"/>
+          <w:szCs w:val="22"/>
+        </w:rPr>
+        <w:t xml:space="preserve"> and removed the entire </w:t>
+      </w:r>
+      <w:r>
+        <w:rPr>
+          <w:rFonts w:ascii="Courier New" w:cs="Courier New" w:eastAsia="Courier New" w:hAnsi="Courier New"/>
+          <w:sz w:val="22"/>
+          <w:szCs w:val="22"/>
+        </w:rPr>
+        <w:t xml:space="preserve">ToolbarItemGroup(placement: .keyboard)</w:t>
+      </w:r>
+      <w:r>
+        <w:rPr>
+          <w:sz w:val="22"/>
+          <w:szCs w:val="22"/>
+        </w:rPr>
+        <w:t xml:space="preserve"> block from </w:t>
+      </w:r>
+      <w:r>
+        <w:rPr>
+          <w:rFonts w:ascii="Courier New" w:cs="Courier New" w:eastAsia="Courier New" w:hAnsi="Courier New"/>
+          <w:sz w:val="22"/>
+          <w:szCs w:val="22"/>
+        </w:rPr>
+        <w:t xml:space="preserve">toolbarContent</w:t>
+      </w:r>
+      <w:r>
+        <w:rPr>
+          <w:sz w:val="22"/>
+          <w:szCs w:val="22"/>
+        </w:rPr>
+        <w:t xml:space="preserve">. The </w:t>
+      </w:r>
+      <w:r>
+        <w:rPr>
+          <w:rFonts w:ascii="Courier New" w:cs="Courier New" w:eastAsia="Courier New" w:hAnsi="Courier New"/>
+          <w:sz w:val="22"/>
+          <w:szCs w:val="22"/>
+        </w:rPr>
+        <w:t xml:space="preserve">.focused($focusedField, equals: .pageNumber)</w:t>
+      </w:r>
+      <w:r>
+        <w:rPr>
+          <w:sz w:val="22"/>
+          <w:szCs w:val="22"/>
+        </w:rPr>
+        <w:t xml:space="preserve"> modifier remains on the new wrapper.</w:t>
+      </w:r>
+    </w:p>
+    <w:p>
+      <w:pPr>
+        <w:spacing w:after="120" w:before="0"/>
+      </w:pPr>
+      <w:r>
+        <w:rPr>
+          <w:sz w:val="22"/>
+          <w:szCs w:val="22"/>
+        </w:rPr>
+        <w:t xml:space="preserve">All three Add Annotation text inputs now use the same UIKit-attached system Done bar button. iOS 26 styles them identically — same circle size, same blue, same white checkmark glyph, same right placement.</w:t>
+      </w:r>
+    </w:p>
+    <w:p>
+      <w:pPr>
+        <w:shd w:fill="E6F1FB" w:val="clear"/>
+        <w:spacing w:after="160" w:before="80"/>
+      </w:pPr>
+      <w:r>
+        <w:rPr>
+          <w:b/>
+          <w:bCs/>
+          <w:color w:val="0C447C"/>
+          <w:sz w:val="22"/>
+          <w:szCs w:val="22"/>
+        </w:rPr>
+        <w:t xml:space="preserve">Tester note: </w:t>
+      </w:r>
+      <w:r>
+        <w:rPr>
+          <w:color w:val="0C447C"/>
+          <w:sz w:val="22"/>
+          <w:szCs w:val="22"/>
+        </w:rPr>
+        <w:t xml:space="preserve">Every keyboard on the Add Annotation screen now shows the same blue circle checkmark on the right. Tapping it dismisses the keyboard.</w:t>
       </w:r>
     </w:p>
     <w:p>
@@ -1876,6 +3338,90 @@
     </w:p>
     <w:p>
       <w:pPr>
+        <w:pStyle w:val="Heading3"/>
+        <w:spacing w:after="100" w:before="200"/>
+      </w:pPr>
+      <w:r>
+        <w:rPr>
+          <w:b/>
+          <w:bCs/>
+          <w:sz w:val="22"/>
+          <w:szCs w:val="22"/>
+        </w:rPr>
+        <w:t xml:space="preserve">5.2 Review scroll state on book stats</w:t>
+      </w:r>
+    </w:p>
+    <w:p>
+      <w:pPr>
+        <w:spacing w:after="120" w:before="0"/>
+      </w:pPr>
+      <w:r>
+        <w:rPr>
+          <w:sz w:val="22"/>
+          <w:szCs w:val="22"/>
+        </w:rPr>
+        <w:t xml:space="preserve">Observed during Phase 4.4 testing on a real device. Reported behavior: the scroll state on the book stats screen gets jumpy when the user scrolls in the same direction as the open/close scroll, and "activation" (whatever expand/collapse or transition is being triggered) requires scrolling all the way down or all the way up before it engages. Likely a scroll-driven animation or sticky-header threshold that needs tuning. Not investigated yet — captured here so it is not lost. Revisit in a future round, ideally alongside other UX polish on the stats / library views.</w:t>
+      </w:r>
+    </w:p>
+    <w:p>
+      <w:pPr>
+        <w:pStyle w:val="Heading3"/>
+        <w:spacing w:after="100" w:before="200"/>
+      </w:pPr>
+      <w:r>
+        <w:rPr>
+          <w:b/>
+          <w:bCs/>
+          <w:sz w:val="22"/>
+          <w:szCs w:val="22"/>
+        </w:rPr>
+        <w:t xml:space="preserve">5.3 Add bold and italic to Quote/Passage formatting toolbar</w:t>
+      </w:r>
+    </w:p>
+    <w:p>
+      <w:pPr>
+        <w:spacing w:after="120" w:before="0"/>
+      </w:pPr>
+      <w:r>
+        <w:rPr>
+          <w:sz w:val="22"/>
+          <w:szCs w:val="22"/>
+        </w:rPr>
+        <w:t xml:space="preserve">The </w:t>
+      </w:r>
+      <w:r>
+        <w:rPr>
+          <w:rFonts w:ascii="Courier New" w:cs="Courier New" w:eastAsia="Courier New" w:hAnsi="Courier New"/>
+          <w:sz w:val="22"/>
+          <w:szCs w:val="22"/>
+        </w:rPr>
+        <w:t xml:space="preserve">FormattedTextEditor</w:t>
+      </w:r>
+      <w:r>
+        <w:rPr>
+          <w:sz w:val="22"/>
+          <w:szCs w:val="22"/>
+        </w:rPr>
+        <w:t xml:space="preserve"> component currently exposes underline, strikethrough, and clear-formatting in its UIToolbar input accessory. Add bold and italic to the same toolbar. Implementation will follow the same pattern as the existing buttons: a new UIBarButtonItem, a coordinator action that toggles the formatting attribute on the selected range, persistence via the existing </w:t>
+      </w:r>
+      <w:r>
+        <w:rPr>
+          <w:rFonts w:ascii="Courier New" w:cs="Courier New" w:eastAsia="Courier New" w:hAnsi="Courier New"/>
+          <w:sz w:val="22"/>
+          <w:szCs w:val="22"/>
+        </w:rPr>
+        <w:t xml:space="preserve">TextFormattingData</w:t>
+      </w:r>
+      <w:r>
+        <w:rPr>
+          <w:sz w:val="22"/>
+          <w:szCs w:val="22"/>
+        </w:rPr>
+        <w:t xml:space="preserve"> model (will need new properties for boldRanges and italicRanges), and toolbar tint logic to indicate active state. Captured here for a future round so the current spell-check fix work stays focused — one thing at a time.</w:t>
+      </w:r>
+    </w:p>
+    <w:p>
+      <w:pPr>
         <w:pStyle w:val="Heading1"/>
         <w:spacing w:after="180" w:before="360"/>
       </w:pPr>
@@ -2424,7 +3970,7 @@
           <w:sz w:val="22"/>
           <w:szCs w:val="22"/>
         </w:rPr>
-        <w:t xml:space="preserve">Add Annotation: tap anywhere to dismiss the keyboard, plus a blue checkmark button in the keyboard bar</w:t>
+        <w:t xml:space="preserve">Add Annotation: every keyboard (Page Number, Personal Notes, Quote/Passage) now shows the same blue circle checkmark in the keyboard accessory bar to dismiss the keyboard</w:t>
       </w:r>
     </w:p>
     <w:p>
@@ -2458,6 +4004,23 @@
           <w:sz w:val="22"/>
           <w:szCs w:val="22"/>
         </w:rPr>
+        <w:t xml:space="preserve">Add Annotation: long lines in Personal Notes wrap correctly at the right edge instead of running off the side</w:t>
+      </w:r>
+    </w:p>
+    <w:p>
+      <w:pPr>
+        <w:pStyle w:val="ListParagraph"/>
+        <w:numPr>
+          <w:ilvl w:val="0"/>
+          <w:numId w:val="2"/>
+        </w:numPr>
+        <w:spacing w:after="80" w:before="0"/>
+      </w:pPr>
+      <w:r>
+        <w:rPr>
+          <w:sz w:val="22"/>
+          <w:szCs w:val="22"/>
+        </w:rPr>
         <w:t xml:space="preserve">Add Annotation: the Genre dropdown now opens when tapped, so switching between color palettes works again (regression introduced when tap-to-dismiss was added, fixed in this build)</w:t>
       </w:r>
     </w:p>
@@ -2557,7 +4120,7 @@
           <w:sz w:val="22"/>
           <w:szCs w:val="22"/>
         </w:rPr>
-        <w:t xml:space="preserve">The unresponsive Done button on the keyboard accessory bar (from the last round) is gone — replaced by a blue checkmark button that actually dismisses the keyboard</w:t>
+        <w:t xml:space="preserve">The unresponsive Done button on the keyboard accessory bar (from the last round) is gone — replaced by the blue circle checkmark that actually dismisses the keyboard</w:t>
       </w:r>
     </w:p>
     <w:sectPr>

</xml_diff>